<commit_message>
Replace report documentation references with verified published papers
</commit_message>
<xml_diff>
--- a/docs/reports/FaultNet-final-report.docx
+++ b/docs/reports/FaultNet-final-report.docx
@@ -103,7 +103,7 @@
           <w:noProof/>
         </w:rPr>
         <w:drawing>
-          <wp:inline distT="0" distB="0" distL="0" distR="0" wp14:anchorId="79827408" wp14:editId="1CAA4FD8">
+          <wp:inline distT="0" distB="0" distL="0" distR="0" wp14:anchorId="60E56F0C" wp14:editId="5CE20E8D">
             <wp:extent cx="3200400" cy="885486"/>
             <wp:effectExtent l="0" t="0" r="0" b="0"/>
             <wp:docPr id="1" name="Picture 1"/>
@@ -162,31 +162,7 @@
         <w:jc w:val="both"/>
       </w:pPr>
       <w:r>
-        <w:t>We</w:t>
-      </w:r>
-      <w:r>
-        <w:t xml:space="preserve"> hereby declare that the report entitled "FaultNet Network Resilience Testing using Controlled Fault Injection" submitted by </w:t>
-      </w:r>
-      <w:r>
-        <w:t>us</w:t>
-      </w:r>
-      <w:r>
-        <w:t xml:space="preserve">, for the BCSE308P - Computer Networks to VIT is a record of </w:t>
-      </w:r>
-      <w:r>
-        <w:t>Bonafide</w:t>
-      </w:r>
-      <w:r>
-        <w:t xml:space="preserve"> work carried out by </w:t>
-      </w:r>
-      <w:r>
-        <w:t>us</w:t>
-      </w:r>
-      <w:r>
-        <w:t xml:space="preserve"> under the supervision of </w:t>
-      </w:r>
-      <w:r>
-        <w:t>Dr. S. Ebenezer Juliet.</w:t>
+        <w:t>We hereby declare that the report entitled "FaultNet Network Resilience Testing using Controlled Fault Injection" submitted by us, for the BCSE308P - Computer Networks to VIT is a record of Bonafide work carried out by us under the supervision of Dr. S. Ebenezer Juliet.</w:t>
       </w:r>
     </w:p>
     <w:p>
@@ -194,10 +170,7 @@
         <w:jc w:val="both"/>
       </w:pPr>
       <w:r>
-        <w:t>We</w:t>
-      </w:r>
-      <w:r>
-        <w:t xml:space="preserve"> further declare that the work reported in this report has not been submitted and will not be submitted, either in part or in full, for any other courses in this institute or any other institute or university.</w:t>
+        <w:t>We further declare that the work reported in this report has not been submitted and will not be submitted, either in part or in full, for any other courses in this institute or any other institute or university.</w:t>
       </w:r>
     </w:p>
     <w:p>
@@ -205,10 +178,7 @@
         <w:spacing w:before="720"/>
       </w:pPr>
       <w:r>
-        <w:t>Place:</w:t>
-      </w:r>
-      <w:r>
-        <w:t xml:space="preserve"> Vellore</w:t>
+        <w:t>Place: Vellore</w:t>
       </w:r>
     </w:p>
     <w:p>
@@ -276,7 +246,7 @@
       <w:r>
         <w:fldChar w:fldCharType="separate"/>
       </w:r>
-      <w:hyperlink w:anchor="_Toc244027337" w:history="1">
+      <w:hyperlink w:anchor="_Toc244031150" w:history="1">
         <w:r>
           <w:rPr>
             <w:rStyle w:val="Hyperlink"/>
@@ -303,7 +273,7 @@
             <w:noProof/>
             <w:webHidden/>
           </w:rPr>
-          <w:instrText xml:space="preserve"> PAGEREF _Toc244027337 \h </w:instrText>
+          <w:instrText xml:space="preserve"> PAGEREF _Toc244031150 \h </w:instrText>
         </w:r>
         <w:r>
           <w:rPr>
@@ -347,7 +317,7 @@
           <w14:ligatures w14:val="standardContextual"/>
         </w:rPr>
       </w:pPr>
-      <w:hyperlink w:anchor="_Toc244027338" w:history="1">
+      <w:hyperlink w:anchor="_Toc244031151" w:history="1">
         <w:r>
           <w:rPr>
             <w:rStyle w:val="Hyperlink"/>
@@ -374,7 +344,7 @@
             <w:noProof/>
             <w:webHidden/>
           </w:rPr>
-          <w:instrText xml:space="preserve"> PAGEREF _Toc244027338 \h </w:instrText>
+          <w:instrText xml:space="preserve"> PAGEREF _Toc244031151 \h </w:instrText>
         </w:r>
         <w:r>
           <w:rPr>
@@ -418,7 +388,7 @@
           <w14:ligatures w14:val="standardContextual"/>
         </w:rPr>
       </w:pPr>
-      <w:hyperlink w:anchor="_Toc244027339" w:history="1">
+      <w:hyperlink w:anchor="_Toc244031152" w:history="1">
         <w:r>
           <w:rPr>
             <w:rStyle w:val="Hyperlink"/>
@@ -445,7 +415,7 @@
             <w:noProof/>
             <w:webHidden/>
           </w:rPr>
-          <w:instrText xml:space="preserve"> PAGEREF _Toc244027339 \h </w:instrText>
+          <w:instrText xml:space="preserve"> PAGEREF _Toc244031152 \h </w:instrText>
         </w:r>
         <w:r>
           <w:rPr>
@@ -489,7 +459,7 @@
           <w14:ligatures w14:val="standardContextual"/>
         </w:rPr>
       </w:pPr>
-      <w:hyperlink w:anchor="_Toc244027340" w:history="1">
+      <w:hyperlink w:anchor="_Toc244031153" w:history="1">
         <w:r>
           <w:rPr>
             <w:rStyle w:val="Hyperlink"/>
@@ -516,7 +486,7 @@
             <w:noProof/>
             <w:webHidden/>
           </w:rPr>
-          <w:instrText xml:space="preserve"> PAGEREF _Toc244027340 \h </w:instrText>
+          <w:instrText xml:space="preserve"> PAGEREF _Toc244031153 \h </w:instrText>
         </w:r>
         <w:r>
           <w:rPr>
@@ -560,7 +530,7 @@
           <w14:ligatures w14:val="standardContextual"/>
         </w:rPr>
       </w:pPr>
-      <w:hyperlink w:anchor="_Toc244027341" w:history="1">
+      <w:hyperlink w:anchor="_Toc244031154" w:history="1">
         <w:r>
           <w:rPr>
             <w:rStyle w:val="Hyperlink"/>
@@ -587,7 +557,7 @@
             <w:noProof/>
             <w:webHidden/>
           </w:rPr>
-          <w:instrText xml:space="preserve"> PAGEREF _Toc244027341 \h </w:instrText>
+          <w:instrText xml:space="preserve"> PAGEREF _Toc244031154 \h </w:instrText>
         </w:r>
         <w:r>
           <w:rPr>
@@ -631,7 +601,7 @@
           <w14:ligatures w14:val="standardContextual"/>
         </w:rPr>
       </w:pPr>
-      <w:hyperlink w:anchor="_Toc244027342" w:history="1">
+      <w:hyperlink w:anchor="_Toc244031155" w:history="1">
         <w:r>
           <w:rPr>
             <w:rStyle w:val="Hyperlink"/>
@@ -658,78 +628,7 @@
             <w:noProof/>
             <w:webHidden/>
           </w:rPr>
-          <w:instrText xml:space="preserve"> PAGEREF _Toc244027342 \h </w:instrText>
-        </w:r>
-        <w:r>
-          <w:rPr>
-            <w:noProof/>
-            <w:webHidden/>
-          </w:rPr>
-        </w:r>
-        <w:r>
-          <w:rPr>
-            <w:noProof/>
-            <w:webHidden/>
-          </w:rPr>
-          <w:fldChar w:fldCharType="separate"/>
-        </w:r>
-        <w:r>
-          <w:rPr>
-            <w:noProof/>
-            <w:webHidden/>
-          </w:rPr>
-          <w:t>7</w:t>
-        </w:r>
-        <w:r>
-          <w:rPr>
-            <w:noProof/>
-            <w:webHidden/>
-          </w:rPr>
-          <w:fldChar w:fldCharType="end"/>
-        </w:r>
-      </w:hyperlink>
-    </w:p>
-    <w:p>
-      <w:pPr>
-        <w:pStyle w:val="TOC1"/>
-        <w:rPr>
-          <w:rFonts w:asciiTheme="minorHAnsi" w:eastAsiaTheme="minorEastAsia" w:hAnsiTheme="minorHAnsi" w:cstheme="minorBidi"/>
-          <w:noProof/>
-          <w:color w:val="auto"/>
-          <w:kern w:val="2"/>
-          <w:sz w:val="24"/>
-          <w:szCs w:val="24"/>
-          <w14:ligatures w14:val="standardContextual"/>
-        </w:rPr>
-      </w:pPr>
-      <w:hyperlink w:anchor="_Toc244027343" w:history="1">
-        <w:r>
-          <w:rPr>
-            <w:rStyle w:val="Hyperlink"/>
-            <w:noProof/>
-          </w:rPr>
-          <w:t>6. Workflow of the Proposed Project work and System Architecture</w:t>
-        </w:r>
-        <w:r>
-          <w:rPr>
-            <w:noProof/>
-            <w:webHidden/>
-          </w:rPr>
-          <w:tab/>
-        </w:r>
-        <w:r>
-          <w:rPr>
-            <w:noProof/>
-            <w:webHidden/>
-          </w:rPr>
-          <w:fldChar w:fldCharType="begin"/>
-        </w:r>
-        <w:r>
-          <w:rPr>
-            <w:noProof/>
-            <w:webHidden/>
-          </w:rPr>
-          <w:instrText xml:space="preserve"> PAGEREF _Toc244027343 \h </w:instrText>
+          <w:instrText xml:space="preserve"> PAGEREF _Toc244031155 \h </w:instrText>
         </w:r>
         <w:r>
           <w:rPr>
@@ -762,7 +661,7 @@
     </w:p>
     <w:p>
       <w:pPr>
-        <w:pStyle w:val="TOC2"/>
+        <w:pStyle w:val="TOC1"/>
         <w:rPr>
           <w:rFonts w:asciiTheme="minorHAnsi" w:eastAsiaTheme="minorEastAsia" w:hAnsiTheme="minorHAnsi" w:cstheme="minorBidi"/>
           <w:noProof/>
@@ -773,13 +672,13 @@
           <w14:ligatures w14:val="standardContextual"/>
         </w:rPr>
       </w:pPr>
-      <w:hyperlink w:anchor="_Toc244027344" w:history="1">
+      <w:hyperlink w:anchor="_Toc244031156" w:history="1">
         <w:r>
           <w:rPr>
             <w:rStyle w:val="Hyperlink"/>
             <w:noProof/>
           </w:rPr>
-          <w:t>6.1 Dashboard Roles and Separation</w:t>
+          <w:t>6. Workflow of the Proposed Project work and System Architecture</w:t>
         </w:r>
         <w:r>
           <w:rPr>
@@ -800,7 +699,7 @@
             <w:noProof/>
             <w:webHidden/>
           </w:rPr>
-          <w:instrText xml:space="preserve"> PAGEREF _Toc244027344 \h </w:instrText>
+          <w:instrText xml:space="preserve"> PAGEREF _Toc244031156 \h </w:instrText>
         </w:r>
         <w:r>
           <w:rPr>
@@ -844,13 +743,13 @@
           <w14:ligatures w14:val="standardContextual"/>
         </w:rPr>
       </w:pPr>
-      <w:hyperlink w:anchor="_Toc244027345" w:history="1">
+      <w:hyperlink w:anchor="_Toc244031157" w:history="1">
         <w:r>
           <w:rPr>
             <w:rStyle w:val="Hyperlink"/>
             <w:noProof/>
           </w:rPr>
-          <w:t>6.2 Workbench Functions and Fault Mechanisms</w:t>
+          <w:t>6.1 Dashboard Roles and Separation</w:t>
         </w:r>
         <w:r>
           <w:rPr>
@@ -871,78 +770,7 @@
             <w:noProof/>
             <w:webHidden/>
           </w:rPr>
-          <w:instrText xml:space="preserve"> PAGEREF _Toc244027345 \h </w:instrText>
-        </w:r>
-        <w:r>
-          <w:rPr>
-            <w:noProof/>
-            <w:webHidden/>
-          </w:rPr>
-        </w:r>
-        <w:r>
-          <w:rPr>
-            <w:noProof/>
-            <w:webHidden/>
-          </w:rPr>
-          <w:fldChar w:fldCharType="separate"/>
-        </w:r>
-        <w:r>
-          <w:rPr>
-            <w:noProof/>
-            <w:webHidden/>
-          </w:rPr>
-          <w:t>9</w:t>
-        </w:r>
-        <w:r>
-          <w:rPr>
-            <w:noProof/>
-            <w:webHidden/>
-          </w:rPr>
-          <w:fldChar w:fldCharType="end"/>
-        </w:r>
-      </w:hyperlink>
-    </w:p>
-    <w:p>
-      <w:pPr>
-        <w:pStyle w:val="TOC2"/>
-        <w:rPr>
-          <w:rFonts w:asciiTheme="minorHAnsi" w:eastAsiaTheme="minorEastAsia" w:hAnsiTheme="minorHAnsi" w:cstheme="minorBidi"/>
-          <w:noProof/>
-          <w:color w:val="auto"/>
-          <w:kern w:val="2"/>
-          <w:sz w:val="24"/>
-          <w:szCs w:val="24"/>
-          <w14:ligatures w14:val="standardContextual"/>
-        </w:rPr>
-      </w:pPr>
-      <w:hyperlink w:anchor="_Toc244027346" w:history="1">
-        <w:r>
-          <w:rPr>
-            <w:rStyle w:val="Hyperlink"/>
-            <w:noProof/>
-          </w:rPr>
-          <w:t>6.3 Live Proxy Cockpit Functions</w:t>
-        </w:r>
-        <w:r>
-          <w:rPr>
-            <w:noProof/>
-            <w:webHidden/>
-          </w:rPr>
-          <w:tab/>
-        </w:r>
-        <w:r>
-          <w:rPr>
-            <w:noProof/>
-            <w:webHidden/>
-          </w:rPr>
-          <w:fldChar w:fldCharType="begin"/>
-        </w:r>
-        <w:r>
-          <w:rPr>
-            <w:noProof/>
-            <w:webHidden/>
-          </w:rPr>
-          <w:instrText xml:space="preserve"> PAGEREF _Toc244027346 \h </w:instrText>
+          <w:instrText xml:space="preserve"> PAGEREF _Toc244031157 \h </w:instrText>
         </w:r>
         <w:r>
           <w:rPr>
@@ -975,7 +803,7 @@
     </w:p>
     <w:p>
       <w:pPr>
-        <w:pStyle w:val="TOC1"/>
+        <w:pStyle w:val="TOC2"/>
         <w:rPr>
           <w:rFonts w:asciiTheme="minorHAnsi" w:eastAsiaTheme="minorEastAsia" w:hAnsiTheme="minorHAnsi" w:cstheme="minorBidi"/>
           <w:noProof/>
@@ -986,13 +814,13 @@
           <w14:ligatures w14:val="standardContextual"/>
         </w:rPr>
       </w:pPr>
-      <w:hyperlink w:anchor="_Toc244027347" w:history="1">
+      <w:hyperlink w:anchor="_Toc244031158" w:history="1">
         <w:r>
           <w:rPr>
             <w:rStyle w:val="Hyperlink"/>
             <w:noProof/>
           </w:rPr>
-          <w:t>7. Contribution of Individual Team Member</w:t>
+          <w:t>6.2 Workbench Functions and Fault Mechanisms</w:t>
         </w:r>
         <w:r>
           <w:rPr>
@@ -1013,7 +841,78 @@
             <w:noProof/>
             <w:webHidden/>
           </w:rPr>
-          <w:instrText xml:space="preserve"> PAGEREF _Toc244027347 \h </w:instrText>
+          <w:instrText xml:space="preserve"> PAGEREF _Toc244031158 \h </w:instrText>
+        </w:r>
+        <w:r>
+          <w:rPr>
+            <w:noProof/>
+            <w:webHidden/>
+          </w:rPr>
+        </w:r>
+        <w:r>
+          <w:rPr>
+            <w:noProof/>
+            <w:webHidden/>
+          </w:rPr>
+          <w:fldChar w:fldCharType="separate"/>
+        </w:r>
+        <w:r>
+          <w:rPr>
+            <w:noProof/>
+            <w:webHidden/>
+          </w:rPr>
+          <w:t>10</w:t>
+        </w:r>
+        <w:r>
+          <w:rPr>
+            <w:noProof/>
+            <w:webHidden/>
+          </w:rPr>
+          <w:fldChar w:fldCharType="end"/>
+        </w:r>
+      </w:hyperlink>
+    </w:p>
+    <w:p>
+      <w:pPr>
+        <w:pStyle w:val="TOC2"/>
+        <w:rPr>
+          <w:rFonts w:asciiTheme="minorHAnsi" w:eastAsiaTheme="minorEastAsia" w:hAnsiTheme="minorHAnsi" w:cstheme="minorBidi"/>
+          <w:noProof/>
+          <w:color w:val="auto"/>
+          <w:kern w:val="2"/>
+          <w:sz w:val="24"/>
+          <w:szCs w:val="24"/>
+          <w14:ligatures w14:val="standardContextual"/>
+        </w:rPr>
+      </w:pPr>
+      <w:hyperlink w:anchor="_Toc244031159" w:history="1">
+        <w:r>
+          <w:rPr>
+            <w:rStyle w:val="Hyperlink"/>
+            <w:noProof/>
+          </w:rPr>
+          <w:t>6.3 Live Proxy Cockpit Functions</w:t>
+        </w:r>
+        <w:r>
+          <w:rPr>
+            <w:noProof/>
+            <w:webHidden/>
+          </w:rPr>
+          <w:tab/>
+        </w:r>
+        <w:r>
+          <w:rPr>
+            <w:noProof/>
+            <w:webHidden/>
+          </w:rPr>
+          <w:fldChar w:fldCharType="begin"/>
+        </w:r>
+        <w:r>
+          <w:rPr>
+            <w:noProof/>
+            <w:webHidden/>
+          </w:rPr>
+          <w:instrText xml:space="preserve"> PAGEREF _Toc244031159 \h </w:instrText>
         </w:r>
         <w:r>
           <w:rPr>
@@ -1057,13 +956,13 @@
           <w14:ligatures w14:val="standardContextual"/>
         </w:rPr>
       </w:pPr>
-      <w:hyperlink w:anchor="_Toc244027348" w:history="1">
+      <w:hyperlink w:anchor="_Toc244031160" w:history="1">
         <w:r>
           <w:rPr>
             <w:rStyle w:val="Hyperlink"/>
             <w:noProof/>
           </w:rPr>
-          <w:t>8. Modules Explanation</w:t>
+          <w:t>7. Contribution of Individual Team Member</w:t>
         </w:r>
         <w:r>
           <w:rPr>
@@ -1084,78 +983,7 @@
             <w:noProof/>
             <w:webHidden/>
           </w:rPr>
-          <w:instrText xml:space="preserve"> PAGEREF _Toc244027348 \h </w:instrText>
-        </w:r>
-        <w:r>
-          <w:rPr>
-            <w:noProof/>
-            <w:webHidden/>
-          </w:rPr>
-        </w:r>
-        <w:r>
-          <w:rPr>
-            <w:noProof/>
-            <w:webHidden/>
-          </w:rPr>
-          <w:fldChar w:fldCharType="separate"/>
-        </w:r>
-        <w:r>
-          <w:rPr>
-            <w:noProof/>
-            <w:webHidden/>
-          </w:rPr>
-          <w:t>11</w:t>
-        </w:r>
-        <w:r>
-          <w:rPr>
-            <w:noProof/>
-            <w:webHidden/>
-          </w:rPr>
-          <w:fldChar w:fldCharType="end"/>
-        </w:r>
-      </w:hyperlink>
-    </w:p>
-    <w:p>
-      <w:pPr>
-        <w:pStyle w:val="TOC1"/>
-        <w:rPr>
-          <w:rFonts w:asciiTheme="minorHAnsi" w:eastAsiaTheme="minorEastAsia" w:hAnsiTheme="minorHAnsi" w:cstheme="minorBidi"/>
-          <w:noProof/>
-          <w:color w:val="auto"/>
-          <w:kern w:val="2"/>
-          <w:sz w:val="24"/>
-          <w:szCs w:val="24"/>
-          <w14:ligatures w14:val="standardContextual"/>
-        </w:rPr>
-      </w:pPr>
-      <w:hyperlink w:anchor="_Toc244027349" w:history="1">
-        <w:r>
-          <w:rPr>
-            <w:rStyle w:val="Hyperlink"/>
-            <w:noProof/>
-          </w:rPr>
-          <w:t>9. Project Implementation</w:t>
-        </w:r>
-        <w:r>
-          <w:rPr>
-            <w:noProof/>
-            <w:webHidden/>
-          </w:rPr>
-          <w:tab/>
-        </w:r>
-        <w:r>
-          <w:rPr>
-            <w:noProof/>
-            <w:webHidden/>
-          </w:rPr>
-          <w:fldChar w:fldCharType="begin"/>
-        </w:r>
-        <w:r>
-          <w:rPr>
-            <w:noProof/>
-            <w:webHidden/>
-          </w:rPr>
-          <w:instrText xml:space="preserve"> PAGEREF _Toc244027349 \h </w:instrText>
+          <w:instrText xml:space="preserve"> PAGEREF _Toc244031160 \h </w:instrText>
         </w:r>
         <w:r>
           <w:rPr>
@@ -1188,7 +1016,7 @@
     </w:p>
     <w:p>
       <w:pPr>
-        <w:pStyle w:val="TOC2"/>
+        <w:pStyle w:val="TOC1"/>
         <w:rPr>
           <w:rFonts w:asciiTheme="minorHAnsi" w:eastAsiaTheme="minorEastAsia" w:hAnsiTheme="minorHAnsi" w:cstheme="minorBidi"/>
           <w:noProof/>
@@ -1199,13 +1027,13 @@
           <w14:ligatures w14:val="standardContextual"/>
         </w:rPr>
       </w:pPr>
-      <w:hyperlink w:anchor="_Toc244027350" w:history="1">
+      <w:hyperlink w:anchor="_Toc244031161" w:history="1">
         <w:r>
           <w:rPr>
             <w:rStyle w:val="Hyperlink"/>
             <w:noProof/>
           </w:rPr>
-          <w:t>9.1 Experimental Setup with Hardware and Software Requirements</w:t>
+          <w:t>8. Modules Explanation</w:t>
         </w:r>
         <w:r>
           <w:rPr>
@@ -1226,7 +1054,7 @@
             <w:noProof/>
             <w:webHidden/>
           </w:rPr>
-          <w:instrText xml:space="preserve"> PAGEREF _Toc244027350 \h </w:instrText>
+          <w:instrText xml:space="preserve"> PAGEREF _Toc244031161 \h </w:instrText>
         </w:r>
         <w:r>
           <w:rPr>
@@ -1259,7 +1087,7 @@
     </w:p>
     <w:p>
       <w:pPr>
-        <w:pStyle w:val="TOC2"/>
+        <w:pStyle w:val="TOC1"/>
         <w:rPr>
           <w:rFonts w:asciiTheme="minorHAnsi" w:eastAsiaTheme="minorEastAsia" w:hAnsiTheme="minorHAnsi" w:cstheme="minorBidi"/>
           <w:noProof/>
@@ -1270,13 +1098,13 @@
           <w14:ligatures w14:val="standardContextual"/>
         </w:rPr>
       </w:pPr>
-      <w:hyperlink w:anchor="_Toc244027351" w:history="1">
+      <w:hyperlink w:anchor="_Toc244031162" w:history="1">
         <w:r>
           <w:rPr>
             <w:rStyle w:val="Hyperlink"/>
             <w:noProof/>
           </w:rPr>
-          <w:t>9.2 Test Cases</w:t>
+          <w:t>9. Project Implementation</w:t>
         </w:r>
         <w:r>
           <w:rPr>
@@ -1297,7 +1125,7 @@
             <w:noProof/>
             <w:webHidden/>
           </w:rPr>
-          <w:instrText xml:space="preserve"> PAGEREF _Toc244027351 \h </w:instrText>
+          <w:instrText xml:space="preserve"> PAGEREF _Toc244031162 \h </w:instrText>
         </w:r>
         <w:r>
           <w:rPr>
@@ -1341,13 +1169,13 @@
           <w14:ligatures w14:val="standardContextual"/>
         </w:rPr>
       </w:pPr>
-      <w:hyperlink w:anchor="_Toc244027352" w:history="1">
+      <w:hyperlink w:anchor="_Toc244031163" w:history="1">
         <w:r>
           <w:rPr>
             <w:rStyle w:val="Hyperlink"/>
             <w:noProof/>
           </w:rPr>
-          <w:t>9.3 Results of Execution and Screenshots</w:t>
+          <w:t>9.1 Experimental Setup with Hardware and Software Requirements</w:t>
         </w:r>
         <w:r>
           <w:rPr>
@@ -1368,7 +1196,78 @@
             <w:noProof/>
             <w:webHidden/>
           </w:rPr>
-          <w:instrText xml:space="preserve"> PAGEREF _Toc244027352 \h </w:instrText>
+          <w:instrText xml:space="preserve"> PAGEREF _Toc244031163 \h </w:instrText>
+        </w:r>
+        <w:r>
+          <w:rPr>
+            <w:noProof/>
+            <w:webHidden/>
+          </w:rPr>
+        </w:r>
+        <w:r>
+          <w:rPr>
+            <w:noProof/>
+            <w:webHidden/>
+          </w:rPr>
+          <w:fldChar w:fldCharType="separate"/>
+        </w:r>
+        <w:r>
+          <w:rPr>
+            <w:noProof/>
+            <w:webHidden/>
+          </w:rPr>
+          <w:t>13</w:t>
+        </w:r>
+        <w:r>
+          <w:rPr>
+            <w:noProof/>
+            <w:webHidden/>
+          </w:rPr>
+          <w:fldChar w:fldCharType="end"/>
+        </w:r>
+      </w:hyperlink>
+    </w:p>
+    <w:p>
+      <w:pPr>
+        <w:pStyle w:val="TOC2"/>
+        <w:rPr>
+          <w:rFonts w:asciiTheme="minorHAnsi" w:eastAsiaTheme="minorEastAsia" w:hAnsiTheme="minorHAnsi" w:cstheme="minorBidi"/>
+          <w:noProof/>
+          <w:color w:val="auto"/>
+          <w:kern w:val="2"/>
+          <w:sz w:val="24"/>
+          <w:szCs w:val="24"/>
+          <w14:ligatures w14:val="standardContextual"/>
+        </w:rPr>
+      </w:pPr>
+      <w:hyperlink w:anchor="_Toc244031164" w:history="1">
+        <w:r>
+          <w:rPr>
+            <w:rStyle w:val="Hyperlink"/>
+            <w:noProof/>
+          </w:rPr>
+          <w:t>9.2 Test Cases</w:t>
+        </w:r>
+        <w:r>
+          <w:rPr>
+            <w:noProof/>
+            <w:webHidden/>
+          </w:rPr>
+          <w:tab/>
+        </w:r>
+        <w:r>
+          <w:rPr>
+            <w:noProof/>
+            <w:webHidden/>
+          </w:rPr>
+          <w:fldChar w:fldCharType="begin"/>
+        </w:r>
+        <w:r>
+          <w:rPr>
+            <w:noProof/>
+            <w:webHidden/>
+          </w:rPr>
+          <w:instrText xml:space="preserve"> PAGEREF _Toc244031164 \h </w:instrText>
         </w:r>
         <w:r>
           <w:rPr>
@@ -1412,7 +1311,78 @@
           <w14:ligatures w14:val="standardContextual"/>
         </w:rPr>
       </w:pPr>
-      <w:hyperlink w:anchor="_Toc244027353" w:history="1">
+      <w:hyperlink w:anchor="_Toc244031165" w:history="1">
+        <w:r>
+          <w:rPr>
+            <w:rStyle w:val="Hyperlink"/>
+            <w:noProof/>
+          </w:rPr>
+          <w:t>9.3 Results of Execution and Screenshots</w:t>
+        </w:r>
+        <w:r>
+          <w:rPr>
+            <w:noProof/>
+            <w:webHidden/>
+          </w:rPr>
+          <w:tab/>
+        </w:r>
+        <w:r>
+          <w:rPr>
+            <w:noProof/>
+            <w:webHidden/>
+          </w:rPr>
+          <w:fldChar w:fldCharType="begin"/>
+        </w:r>
+        <w:r>
+          <w:rPr>
+            <w:noProof/>
+            <w:webHidden/>
+          </w:rPr>
+          <w:instrText xml:space="preserve"> PAGEREF _Toc244031165 \h </w:instrText>
+        </w:r>
+        <w:r>
+          <w:rPr>
+            <w:noProof/>
+            <w:webHidden/>
+          </w:rPr>
+        </w:r>
+        <w:r>
+          <w:rPr>
+            <w:noProof/>
+            <w:webHidden/>
+          </w:rPr>
+          <w:fldChar w:fldCharType="separate"/>
+        </w:r>
+        <w:r>
+          <w:rPr>
+            <w:noProof/>
+            <w:webHidden/>
+          </w:rPr>
+          <w:t>15</w:t>
+        </w:r>
+        <w:r>
+          <w:rPr>
+            <w:noProof/>
+            <w:webHidden/>
+          </w:rPr>
+          <w:fldChar w:fldCharType="end"/>
+        </w:r>
+      </w:hyperlink>
+    </w:p>
+    <w:p>
+      <w:pPr>
+        <w:pStyle w:val="TOC2"/>
+        <w:rPr>
+          <w:rFonts w:asciiTheme="minorHAnsi" w:eastAsiaTheme="minorEastAsia" w:hAnsiTheme="minorHAnsi" w:cstheme="minorBidi"/>
+          <w:noProof/>
+          <w:color w:val="auto"/>
+          <w:kern w:val="2"/>
+          <w:sz w:val="24"/>
+          <w:szCs w:val="24"/>
+          <w14:ligatures w14:val="standardContextual"/>
+        </w:rPr>
+      </w:pPr>
+      <w:hyperlink w:anchor="_Toc244031166" w:history="1">
         <w:r>
           <w:rPr>
             <w:rStyle w:val="Hyperlink"/>
@@ -1439,7 +1409,7 @@
             <w:noProof/>
             <w:webHidden/>
           </w:rPr>
-          <w:instrText xml:space="preserve"> PAGEREF _Toc244027353 \h </w:instrText>
+          <w:instrText xml:space="preserve"> PAGEREF _Toc244031166 \h </w:instrText>
         </w:r>
         <w:r>
           <w:rPr>
@@ -1459,7 +1429,7 @@
             <w:noProof/>
             <w:webHidden/>
           </w:rPr>
-          <w:t>16</w:t>
+          <w:t>17</w:t>
         </w:r>
         <w:r>
           <w:rPr>
@@ -1483,7 +1453,7 @@
           <w14:ligatures w14:val="standardContextual"/>
         </w:rPr>
       </w:pPr>
-      <w:hyperlink w:anchor="_Toc244027354" w:history="1">
+      <w:hyperlink w:anchor="_Toc244031167" w:history="1">
         <w:r>
           <w:rPr>
             <w:rStyle w:val="Hyperlink"/>
@@ -1510,78 +1480,7 @@
             <w:noProof/>
             <w:webHidden/>
           </w:rPr>
-          <w:instrText xml:space="preserve"> PAGEREF _Toc244027354 \h </w:instrText>
-        </w:r>
-        <w:r>
-          <w:rPr>
-            <w:noProof/>
-            <w:webHidden/>
-          </w:rPr>
-        </w:r>
-        <w:r>
-          <w:rPr>
-            <w:noProof/>
-            <w:webHidden/>
-          </w:rPr>
-          <w:fldChar w:fldCharType="separate"/>
-        </w:r>
-        <w:r>
-          <w:rPr>
-            <w:noProof/>
-            <w:webHidden/>
-          </w:rPr>
-          <w:t>25</w:t>
-        </w:r>
-        <w:r>
-          <w:rPr>
-            <w:noProof/>
-            <w:webHidden/>
-          </w:rPr>
-          <w:fldChar w:fldCharType="end"/>
-        </w:r>
-      </w:hyperlink>
-    </w:p>
-    <w:p>
-      <w:pPr>
-        <w:pStyle w:val="TOC1"/>
-        <w:rPr>
-          <w:rFonts w:asciiTheme="minorHAnsi" w:eastAsiaTheme="minorEastAsia" w:hAnsiTheme="minorHAnsi" w:cstheme="minorBidi"/>
-          <w:noProof/>
-          <w:color w:val="auto"/>
-          <w:kern w:val="2"/>
-          <w:sz w:val="24"/>
-          <w:szCs w:val="24"/>
-          <w14:ligatures w14:val="standardContextual"/>
-        </w:rPr>
-      </w:pPr>
-      <w:hyperlink w:anchor="_Toc244027355" w:history="1">
-        <w:r>
-          <w:rPr>
-            <w:rStyle w:val="Hyperlink"/>
-            <w:noProof/>
-          </w:rPr>
-          <w:t>10. Results and Discussion</w:t>
-        </w:r>
-        <w:r>
-          <w:rPr>
-            <w:noProof/>
-            <w:webHidden/>
-          </w:rPr>
-          <w:tab/>
-        </w:r>
-        <w:r>
-          <w:rPr>
-            <w:noProof/>
-            <w:webHidden/>
-          </w:rPr>
-          <w:fldChar w:fldCharType="begin"/>
-        </w:r>
-        <w:r>
-          <w:rPr>
-            <w:noProof/>
-            <w:webHidden/>
-          </w:rPr>
-          <w:instrText xml:space="preserve"> PAGEREF _Toc244027355 \h </w:instrText>
+          <w:instrText xml:space="preserve"> PAGEREF _Toc244031167 \h </w:instrText>
         </w:r>
         <w:r>
           <w:rPr>
@@ -1614,7 +1513,7 @@
     </w:p>
     <w:p>
       <w:pPr>
-        <w:pStyle w:val="TOC2"/>
+        <w:pStyle w:val="TOC1"/>
         <w:rPr>
           <w:rFonts w:asciiTheme="minorHAnsi" w:eastAsiaTheme="minorEastAsia" w:hAnsiTheme="minorHAnsi" w:cstheme="minorBidi"/>
           <w:noProof/>
@@ -1625,13 +1524,13 @@
           <w14:ligatures w14:val="standardContextual"/>
         </w:rPr>
       </w:pPr>
-      <w:hyperlink w:anchor="_Toc244027356" w:history="1">
+      <w:hyperlink w:anchor="_Toc244031168" w:history="1">
         <w:r>
           <w:rPr>
             <w:rStyle w:val="Hyperlink"/>
             <w:noProof/>
           </w:rPr>
-          <w:t>10.1 Findings and Inferences</w:t>
+          <w:t>10. Results and Discussion</w:t>
         </w:r>
         <w:r>
           <w:rPr>
@@ -1652,220 +1551,7 @@
             <w:noProof/>
             <w:webHidden/>
           </w:rPr>
-          <w:instrText xml:space="preserve"> PAGEREF _Toc244027356 \h </w:instrText>
-        </w:r>
-        <w:r>
-          <w:rPr>
-            <w:noProof/>
-            <w:webHidden/>
-          </w:rPr>
-        </w:r>
-        <w:r>
-          <w:rPr>
-            <w:noProof/>
-            <w:webHidden/>
-          </w:rPr>
-          <w:fldChar w:fldCharType="separate"/>
-        </w:r>
-        <w:r>
-          <w:rPr>
-            <w:noProof/>
-            <w:webHidden/>
-          </w:rPr>
-          <w:t>26</w:t>
-        </w:r>
-        <w:r>
-          <w:rPr>
-            <w:noProof/>
-            <w:webHidden/>
-          </w:rPr>
-          <w:fldChar w:fldCharType="end"/>
-        </w:r>
-      </w:hyperlink>
-    </w:p>
-    <w:p>
-      <w:pPr>
-        <w:pStyle w:val="TOC2"/>
-        <w:rPr>
-          <w:rFonts w:asciiTheme="minorHAnsi" w:eastAsiaTheme="minorEastAsia" w:hAnsiTheme="minorHAnsi" w:cstheme="minorBidi"/>
-          <w:noProof/>
-          <w:color w:val="auto"/>
-          <w:kern w:val="2"/>
-          <w:sz w:val="24"/>
-          <w:szCs w:val="24"/>
-          <w14:ligatures w14:val="standardContextual"/>
-        </w:rPr>
-      </w:pPr>
-      <w:hyperlink w:anchor="_Toc244027357" w:history="1">
-        <w:r>
-          <w:rPr>
-            <w:rStyle w:val="Hyperlink"/>
-            <w:noProof/>
-          </w:rPr>
-          <w:t>10.2 Innovation Novelty and Evidence</w:t>
-        </w:r>
-        <w:r>
-          <w:rPr>
-            <w:noProof/>
-            <w:webHidden/>
-          </w:rPr>
-          <w:tab/>
-        </w:r>
-        <w:r>
-          <w:rPr>
-            <w:noProof/>
-            <w:webHidden/>
-          </w:rPr>
-          <w:fldChar w:fldCharType="begin"/>
-        </w:r>
-        <w:r>
-          <w:rPr>
-            <w:noProof/>
-            <w:webHidden/>
-          </w:rPr>
-          <w:instrText xml:space="preserve"> PAGEREF _Toc244027357 \h </w:instrText>
-        </w:r>
-        <w:r>
-          <w:rPr>
-            <w:noProof/>
-            <w:webHidden/>
-          </w:rPr>
-        </w:r>
-        <w:r>
-          <w:rPr>
-            <w:noProof/>
-            <w:webHidden/>
-          </w:rPr>
-          <w:fldChar w:fldCharType="separate"/>
-        </w:r>
-        <w:r>
-          <w:rPr>
-            <w:noProof/>
-            <w:webHidden/>
-          </w:rPr>
-          <w:t>26</w:t>
-        </w:r>
-        <w:r>
-          <w:rPr>
-            <w:noProof/>
-            <w:webHidden/>
-          </w:rPr>
-          <w:fldChar w:fldCharType="end"/>
-        </w:r>
-      </w:hyperlink>
-    </w:p>
-    <w:p>
-      <w:pPr>
-        <w:pStyle w:val="TOC1"/>
-        <w:rPr>
-          <w:rFonts w:asciiTheme="minorHAnsi" w:eastAsiaTheme="minorEastAsia" w:hAnsiTheme="minorHAnsi" w:cstheme="minorBidi"/>
-          <w:noProof/>
-          <w:color w:val="auto"/>
-          <w:kern w:val="2"/>
-          <w:sz w:val="24"/>
-          <w:szCs w:val="24"/>
-          <w14:ligatures w14:val="standardContextual"/>
-        </w:rPr>
-      </w:pPr>
-      <w:hyperlink w:anchor="_Toc244027358" w:history="1">
-        <w:r>
-          <w:rPr>
-            <w:rStyle w:val="Hyperlink"/>
-            <w:noProof/>
-          </w:rPr>
-          <w:t>11. Conclusion</w:t>
-        </w:r>
-        <w:r>
-          <w:rPr>
-            <w:noProof/>
-            <w:webHidden/>
-          </w:rPr>
-          <w:tab/>
-        </w:r>
-        <w:r>
-          <w:rPr>
-            <w:noProof/>
-            <w:webHidden/>
-          </w:rPr>
-          <w:fldChar w:fldCharType="begin"/>
-        </w:r>
-        <w:r>
-          <w:rPr>
-            <w:noProof/>
-            <w:webHidden/>
-          </w:rPr>
-          <w:instrText xml:space="preserve"> PAGEREF _Toc244027358 \h </w:instrText>
-        </w:r>
-        <w:r>
-          <w:rPr>
-            <w:noProof/>
-            <w:webHidden/>
-          </w:rPr>
-        </w:r>
-        <w:r>
-          <w:rPr>
-            <w:noProof/>
-            <w:webHidden/>
-          </w:rPr>
-          <w:fldChar w:fldCharType="separate"/>
-        </w:r>
-        <w:r>
-          <w:rPr>
-            <w:noProof/>
-            <w:webHidden/>
-          </w:rPr>
-          <w:t>26</w:t>
-        </w:r>
-        <w:r>
-          <w:rPr>
-            <w:noProof/>
-            <w:webHidden/>
-          </w:rPr>
-          <w:fldChar w:fldCharType="end"/>
-        </w:r>
-      </w:hyperlink>
-    </w:p>
-    <w:p>
-      <w:pPr>
-        <w:pStyle w:val="TOC1"/>
-        <w:rPr>
-          <w:rFonts w:asciiTheme="minorHAnsi" w:eastAsiaTheme="minorEastAsia" w:hAnsiTheme="minorHAnsi" w:cstheme="minorBidi"/>
-          <w:noProof/>
-          <w:color w:val="auto"/>
-          <w:kern w:val="2"/>
-          <w:sz w:val="24"/>
-          <w:szCs w:val="24"/>
-          <w14:ligatures w14:val="standardContextual"/>
-        </w:rPr>
-      </w:pPr>
-      <w:hyperlink w:anchor="_Toc244027359" w:history="1">
-        <w:r>
-          <w:rPr>
-            <w:rStyle w:val="Hyperlink"/>
-            <w:noProof/>
-          </w:rPr>
-          <w:t>12. Limitations and Future Enhancement</w:t>
-        </w:r>
-        <w:r>
-          <w:rPr>
-            <w:noProof/>
-            <w:webHidden/>
-          </w:rPr>
-          <w:tab/>
-        </w:r>
-        <w:r>
-          <w:rPr>
-            <w:noProof/>
-            <w:webHidden/>
-          </w:rPr>
-          <w:fldChar w:fldCharType="begin"/>
-        </w:r>
-        <w:r>
-          <w:rPr>
-            <w:noProof/>
-            <w:webHidden/>
-          </w:rPr>
-          <w:instrText xml:space="preserve"> PAGEREF _Toc244027359 \h </w:instrText>
+          <w:instrText xml:space="preserve"> PAGEREF _Toc244031168 \h </w:instrText>
         </w:r>
         <w:r>
           <w:rPr>
@@ -1898,7 +1584,7 @@
     </w:p>
     <w:p>
       <w:pPr>
-        <w:pStyle w:val="TOC1"/>
+        <w:pStyle w:val="TOC2"/>
         <w:rPr>
           <w:rFonts w:asciiTheme="minorHAnsi" w:eastAsiaTheme="minorEastAsia" w:hAnsiTheme="minorHAnsi" w:cstheme="minorBidi"/>
           <w:noProof/>
@@ -1909,13 +1595,13 @@
           <w14:ligatures w14:val="standardContextual"/>
         </w:rPr>
       </w:pPr>
-      <w:hyperlink w:anchor="_Toc244027360" w:history="1">
+      <w:hyperlink w:anchor="_Toc244031169" w:history="1">
         <w:r>
           <w:rPr>
             <w:rStyle w:val="Hyperlink"/>
             <w:noProof/>
           </w:rPr>
-          <w:t>References</w:t>
+          <w:t>10.1 Findings and Inferences</w:t>
         </w:r>
         <w:r>
           <w:rPr>
@@ -1936,7 +1622,220 @@
             <w:noProof/>
             <w:webHidden/>
           </w:rPr>
-          <w:instrText xml:space="preserve"> PAGEREF _Toc244027360 \h </w:instrText>
+          <w:instrText xml:space="preserve"> PAGEREF _Toc244031169 \h </w:instrText>
+        </w:r>
+        <w:r>
+          <w:rPr>
+            <w:noProof/>
+            <w:webHidden/>
+          </w:rPr>
+        </w:r>
+        <w:r>
+          <w:rPr>
+            <w:noProof/>
+            <w:webHidden/>
+          </w:rPr>
+          <w:fldChar w:fldCharType="separate"/>
+        </w:r>
+        <w:r>
+          <w:rPr>
+            <w:noProof/>
+            <w:webHidden/>
+          </w:rPr>
+          <w:t>27</w:t>
+        </w:r>
+        <w:r>
+          <w:rPr>
+            <w:noProof/>
+            <w:webHidden/>
+          </w:rPr>
+          <w:fldChar w:fldCharType="end"/>
+        </w:r>
+      </w:hyperlink>
+    </w:p>
+    <w:p>
+      <w:pPr>
+        <w:pStyle w:val="TOC2"/>
+        <w:rPr>
+          <w:rFonts w:asciiTheme="minorHAnsi" w:eastAsiaTheme="minorEastAsia" w:hAnsiTheme="minorHAnsi" w:cstheme="minorBidi"/>
+          <w:noProof/>
+          <w:color w:val="auto"/>
+          <w:kern w:val="2"/>
+          <w:sz w:val="24"/>
+          <w:szCs w:val="24"/>
+          <w14:ligatures w14:val="standardContextual"/>
+        </w:rPr>
+      </w:pPr>
+      <w:hyperlink w:anchor="_Toc244031170" w:history="1">
+        <w:r>
+          <w:rPr>
+            <w:rStyle w:val="Hyperlink"/>
+            <w:noProof/>
+          </w:rPr>
+          <w:t>10.2 Innovation Novelty and Evidence</w:t>
+        </w:r>
+        <w:r>
+          <w:rPr>
+            <w:noProof/>
+            <w:webHidden/>
+          </w:rPr>
+          <w:tab/>
+        </w:r>
+        <w:r>
+          <w:rPr>
+            <w:noProof/>
+            <w:webHidden/>
+          </w:rPr>
+          <w:fldChar w:fldCharType="begin"/>
+        </w:r>
+        <w:r>
+          <w:rPr>
+            <w:noProof/>
+            <w:webHidden/>
+          </w:rPr>
+          <w:instrText xml:space="preserve"> PAGEREF _Toc244031170 \h </w:instrText>
+        </w:r>
+        <w:r>
+          <w:rPr>
+            <w:noProof/>
+            <w:webHidden/>
+          </w:rPr>
+        </w:r>
+        <w:r>
+          <w:rPr>
+            <w:noProof/>
+            <w:webHidden/>
+          </w:rPr>
+          <w:fldChar w:fldCharType="separate"/>
+        </w:r>
+        <w:r>
+          <w:rPr>
+            <w:noProof/>
+            <w:webHidden/>
+          </w:rPr>
+          <w:t>27</w:t>
+        </w:r>
+        <w:r>
+          <w:rPr>
+            <w:noProof/>
+            <w:webHidden/>
+          </w:rPr>
+          <w:fldChar w:fldCharType="end"/>
+        </w:r>
+      </w:hyperlink>
+    </w:p>
+    <w:p>
+      <w:pPr>
+        <w:pStyle w:val="TOC1"/>
+        <w:rPr>
+          <w:rFonts w:asciiTheme="minorHAnsi" w:eastAsiaTheme="minorEastAsia" w:hAnsiTheme="minorHAnsi" w:cstheme="minorBidi"/>
+          <w:noProof/>
+          <w:color w:val="auto"/>
+          <w:kern w:val="2"/>
+          <w:sz w:val="24"/>
+          <w:szCs w:val="24"/>
+          <w14:ligatures w14:val="standardContextual"/>
+        </w:rPr>
+      </w:pPr>
+      <w:hyperlink w:anchor="_Toc244031171" w:history="1">
+        <w:r>
+          <w:rPr>
+            <w:rStyle w:val="Hyperlink"/>
+            <w:noProof/>
+          </w:rPr>
+          <w:t>11. Conclusion</w:t>
+        </w:r>
+        <w:r>
+          <w:rPr>
+            <w:noProof/>
+            <w:webHidden/>
+          </w:rPr>
+          <w:tab/>
+        </w:r>
+        <w:r>
+          <w:rPr>
+            <w:noProof/>
+            <w:webHidden/>
+          </w:rPr>
+          <w:fldChar w:fldCharType="begin"/>
+        </w:r>
+        <w:r>
+          <w:rPr>
+            <w:noProof/>
+            <w:webHidden/>
+          </w:rPr>
+          <w:instrText xml:space="preserve"> PAGEREF _Toc244031171 \h </w:instrText>
+        </w:r>
+        <w:r>
+          <w:rPr>
+            <w:noProof/>
+            <w:webHidden/>
+          </w:rPr>
+        </w:r>
+        <w:r>
+          <w:rPr>
+            <w:noProof/>
+            <w:webHidden/>
+          </w:rPr>
+          <w:fldChar w:fldCharType="separate"/>
+        </w:r>
+        <w:r>
+          <w:rPr>
+            <w:noProof/>
+            <w:webHidden/>
+          </w:rPr>
+          <w:t>27</w:t>
+        </w:r>
+        <w:r>
+          <w:rPr>
+            <w:noProof/>
+            <w:webHidden/>
+          </w:rPr>
+          <w:fldChar w:fldCharType="end"/>
+        </w:r>
+      </w:hyperlink>
+    </w:p>
+    <w:p>
+      <w:pPr>
+        <w:pStyle w:val="TOC1"/>
+        <w:rPr>
+          <w:rFonts w:asciiTheme="minorHAnsi" w:eastAsiaTheme="minorEastAsia" w:hAnsiTheme="minorHAnsi" w:cstheme="minorBidi"/>
+          <w:noProof/>
+          <w:color w:val="auto"/>
+          <w:kern w:val="2"/>
+          <w:sz w:val="24"/>
+          <w:szCs w:val="24"/>
+          <w14:ligatures w14:val="standardContextual"/>
+        </w:rPr>
+      </w:pPr>
+      <w:hyperlink w:anchor="_Toc244031172" w:history="1">
+        <w:r>
+          <w:rPr>
+            <w:rStyle w:val="Hyperlink"/>
+            <w:noProof/>
+          </w:rPr>
+          <w:t>12. Limitations and Future Enhancement</w:t>
+        </w:r>
+        <w:r>
+          <w:rPr>
+            <w:noProof/>
+            <w:webHidden/>
+          </w:rPr>
+          <w:tab/>
+        </w:r>
+        <w:r>
+          <w:rPr>
+            <w:noProof/>
+            <w:webHidden/>
+          </w:rPr>
+          <w:fldChar w:fldCharType="begin"/>
+        </w:r>
+        <w:r>
+          <w:rPr>
+            <w:noProof/>
+            <w:webHidden/>
+          </w:rPr>
+          <w:instrText xml:space="preserve"> PAGEREF _Toc244031172 \h </w:instrText>
         </w:r>
         <w:r>
           <w:rPr>
@@ -1969,6 +1868,77 @@
     </w:p>
     <w:p>
       <w:pPr>
+        <w:pStyle w:val="TOC1"/>
+        <w:rPr>
+          <w:rFonts w:asciiTheme="minorHAnsi" w:eastAsiaTheme="minorEastAsia" w:hAnsiTheme="minorHAnsi" w:cstheme="minorBidi"/>
+          <w:noProof/>
+          <w:color w:val="auto"/>
+          <w:kern w:val="2"/>
+          <w:sz w:val="24"/>
+          <w:szCs w:val="24"/>
+          <w14:ligatures w14:val="standardContextual"/>
+        </w:rPr>
+      </w:pPr>
+      <w:hyperlink w:anchor="_Toc244031173" w:history="1">
+        <w:r>
+          <w:rPr>
+            <w:rStyle w:val="Hyperlink"/>
+            <w:noProof/>
+          </w:rPr>
+          <w:t>References</w:t>
+        </w:r>
+        <w:r>
+          <w:rPr>
+            <w:noProof/>
+            <w:webHidden/>
+          </w:rPr>
+          <w:tab/>
+        </w:r>
+        <w:r>
+          <w:rPr>
+            <w:noProof/>
+            <w:webHidden/>
+          </w:rPr>
+          <w:fldChar w:fldCharType="begin"/>
+        </w:r>
+        <w:r>
+          <w:rPr>
+            <w:noProof/>
+            <w:webHidden/>
+          </w:rPr>
+          <w:instrText xml:space="preserve"> PAGEREF _Toc244031173 \h </w:instrText>
+        </w:r>
+        <w:r>
+          <w:rPr>
+            <w:noProof/>
+            <w:webHidden/>
+          </w:rPr>
+        </w:r>
+        <w:r>
+          <w:rPr>
+            <w:noProof/>
+            <w:webHidden/>
+          </w:rPr>
+          <w:fldChar w:fldCharType="separate"/>
+        </w:r>
+        <w:r>
+          <w:rPr>
+            <w:noProof/>
+            <w:webHidden/>
+          </w:rPr>
+          <w:t>29</w:t>
+        </w:r>
+        <w:r>
+          <w:rPr>
+            <w:noProof/>
+            <w:webHidden/>
+          </w:rPr>
+          <w:fldChar w:fldCharType="end"/>
+        </w:r>
+      </w:hyperlink>
+    </w:p>
+    <w:p>
+      <w:pPr>
         <w:jc w:val="both"/>
       </w:pPr>
       <w:r>
@@ -1980,7 +1950,7 @@
         <w:pStyle w:val="Heading1"/>
         <w:pageBreakBefore/>
       </w:pPr>
-      <w:bookmarkStart w:id="0" w:name="_Toc244027337"/>
+      <w:bookmarkStart w:id="0" w:name="_Toc244031150"/>
       <w:r>
         <w:lastRenderedPageBreak/>
         <w:t>1. Introduction</w:t>
@@ -2015,7 +1985,7 @@
       <w:pPr>
         <w:pStyle w:val="Heading2"/>
       </w:pPr>
-      <w:bookmarkStart w:id="1" w:name="_Toc244027338"/>
+      <w:bookmarkStart w:id="1" w:name="_Toc244031151"/>
       <w:r>
         <w:t>1.1 Practical Applications</w:t>
       </w:r>
@@ -2041,7 +2011,7 @@
       <w:pPr>
         <w:pStyle w:val="Heading1"/>
       </w:pPr>
-      <w:bookmarkStart w:id="2" w:name="_Toc244027339"/>
+      <w:bookmarkStart w:id="2" w:name="_Toc244031152"/>
       <w:r>
         <w:t>2. Problem Statement</w:t>
       </w:r>
@@ -2067,7 +2037,7 @@
       <w:pPr>
         <w:pStyle w:val="Heading1"/>
       </w:pPr>
-      <w:bookmarkStart w:id="3" w:name="_Toc244027340"/>
+      <w:bookmarkStart w:id="3" w:name="_Toc244031153"/>
       <w:r>
         <w:lastRenderedPageBreak/>
         <w:t>3. Objectives</w:t>
@@ -2135,7 +2105,7 @@
         <w:pStyle w:val="Heading1"/>
         <w:pageBreakBefore/>
       </w:pPr>
-      <w:bookmarkStart w:id="4" w:name="_Toc244027341"/>
+      <w:bookmarkStart w:id="4" w:name="_Toc244031154"/>
       <w:r>
         <w:lastRenderedPageBreak/>
         <w:t>4. Literature Review and Existing System</w:t>
@@ -2147,7 +2117,7 @@
         <w:jc w:val="both"/>
       </w:pPr>
       <w:r>
-        <w:t>HTTP semantics distinguish the meaning of a response status from the success of transmitting a complete message [1]. This matters when comparing a valid HTTP 503 response with a request whose connection closes before completion. A complete transport exchange can carry an application error, while an interrupted exchange may have no usable status or payload. FaultNet records these cases separately.</w:t>
+        <w:t>Published work on resilience testing and network experimentation provides the methodological basis for FaultNet. The following studies address deliberate failures, controlled emulation, packet-level interpretation and reproducibility. Their relevance is a connection between experimental methods; their published performance results are not treated as measurements of FaultNet.</w:t>
       </w:r>
     </w:p>
     <w:p>
@@ -2155,7 +2125,7 @@
         <w:jc w:val="both"/>
       </w:pPr>
       <w:r>
-        <w:t>Node.js supplies the HTTP client/server facilities and a high-resolution elapsed-time clock used by the implementation [2]. These facilities permit real loopback exchanges without a framework dependency. Elapsed timing and UTC timestamps serve different purposes: the former measures duration, while the latter associates observations with capture evidence.</w:t>
+        <w:t>Basiri et al. describe chaos engineering as experimentation on distributed systems using hypotheses about measurable steady-state behavior [1]. The study emphasizes observing the effect of disruptive events at the system boundary. FaultNet adopts a bounded local comparison: a fixed workload is measured before, during and after a selected fault. Its successful-payload and latency measurements are local HTTP indicators; the project does not claim to reproduce Netflix's production-scale experiments or business-level availability metrics.</w:t>
       </w:r>
     </w:p>
     <w:p>
@@ -2163,7 +2133,7 @@
         <w:jc w:val="both"/>
       </w:pPr>
       <w:r>
-        <w:t>Toxiproxy is an established TCP proxy for testing network and system conditions [3]. Its existence shows that proxy-based fault injection is an established technique. FaultNet's contribution is its educational HTTP workflow, integrated phase statistics, saved records and separate live cockpit, rather than a claim to have invented latency or bandwidth injection. This report does not benchmark Toxiproxy or claim a speed advantage over it.</w:t>
+        <w:t>Alvaro, Rosen and Hellerstein introduce lineage-driven fault injection, implemented by MOLLY, which reasons backward from a successful outcome to identify failure combinations worth testing [2]. This provides a research basis for relating an injected failure to an explicit outcome instead of merely displaying fault settings. FaultNet uses operator-selected scenarios and a fixed response contract. It does not perform lineage analysis, automatically search distributed failure schedules or provide MOLLY's configuration-specific completeness guarantees.</w:t>
       </w:r>
     </w:p>
     <w:p>
@@ -2171,23 +2141,48 @@
         <w:jc w:val="both"/>
       </w:pPr>
       <w:r>
-        <w:t>Wireshark reconstructs protocol messages from underlying packet segments. Reassembled data is displayed on the final packet of a reconstructed unit, which can differ from the first arrival of response data [4]. Accurate interpretation therefore separates first-response timing from complete-response timing. Packet Tracer routing labs supply a different form of evidence: RIPv2 uses distance-vector routing with hop-count metrics [5], while OSPF maintains link-state information and derives paths using costs [6]</w:t>
-      </w:r>
-      <w:r>
-        <w:t>. Their metric values are not directly interchangeable.</w:t>
+        <w:t>Carbone and Rizzo examine Dummynet's link-emulation capabilities and the operating conditions that affect experimental accuracy [3]. Their work makes fidelity a measurement question, rather than an assumption that a configured rate or delay is achieved exactly. FaultNet applies HTTP forwarding waits and body pacing in user space. Its calibration study therefore compares observed timing and payload goodput with configured settings. Dummynet models network-link behavior more broadly; the two systems act at different layers and are not benchmarked against each other here.</w:t>
       </w:r>
     </w:p>
     <w:p>
       <w:pPr>
+        <w:jc w:val="both"/>
+      </w:pPr>
+      <w:r>
+        <w:t>Paxson studies end-to-end Internet packet dynamics using TCP traces and separates transport behavior from underlying network effects [4]. This supports careful interpretation of packet observations alongside application measurements. FaultNet correlates individual requests with captured streams and distinguishes response data arrival, HTTP reconstruction and completion of the application's read. Its local loopback results are not presented as estimates of Internet-wide delay, loss, reordering or congestion, and an HTTP completion failure is not relabelled as IP packet loss.</w:t>
+      </w:r>
+    </w:p>
+    <w:p>
+      <w:pPr>
+        <w:jc w:val="both"/>
+      </w:pPr>
+      <w:r>
+        <w:t>Lantz, Heller and McKeown present Mininet as an interactive network-prototyping environment using lightweight operating-system virtualization [5]. The study demonstrates the value of constructing controllable topologies on one computer while acknowledging performance-fidelity limits. FaultNet uses a real local HTTP data path, whereas its separate Packet Tracer cases examine simulated routing and alternate-path selection. These activities answer different questions. The project does not claim to run Mininet or to equate a simulator topology with a measured production network.</w:t>
+      </w:r>
+    </w:p>
+    <w:p>
+      <w:pPr>
+        <w:jc w:val="both"/>
+      </w:pPr>
+      <w:r>
+        <w:lastRenderedPageBreak/>
+        <w:t>Handigol et al. evaluate reproducible network experiments using container-based emulation and Mininet-HiFi, emphasizing resource isolation, provisioning and monitoring [6]. Their study connects a repeatable experimental setup with the credibility of reported results. FaultNet records settings, runtime, sample counts and validated outcomes, and supplies analysis scripts for its tables and figures. The present evaluation retains ordinary desktop scheduling and one host, so the report confines its quantitative conclusions to that environment rather than claiming equivalent isolation or performance fidelity.</w:t>
+      </w:r>
+    </w:p>
+    <w:p>
+      <w:pPr>
         <w:pStyle w:val="Caption"/>
         <w:keepNext/>
         <w:jc w:val="center"/>
+        <w:rPr>
+          <w:b w:val="0"/>
+        </w:rPr>
       </w:pPr>
       <w:r>
         <w:rPr>
           <w:b w:val="0"/>
         </w:rPr>
-        <w:t>Table 1. Roles of existing approaches and the project</w:t>
+        <w:t>Table 1. Published approaches and relationship to FaultNet</w:t>
       </w:r>
     </w:p>
     <w:tbl>
@@ -2203,6 +2198,12 @@
           <w:insideV w:val="single" w:sz="5" w:space="0" w:color="D9D9D9"/>
         </w:tblBorders>
         <w:tblLayout w:type="fixed"/>
+        <w:tblCellMar>
+          <w:top w:w="85" w:type="dxa"/>
+          <w:left w:w="85" w:type="dxa"/>
+          <w:bottom w:w="85" w:type="dxa"/>
+          <w:right w:w="85" w:type="dxa"/>
+        </w:tblCellMar>
         <w:tblLook w:val="04A0" w:firstRow="1" w:lastRow="0" w:firstColumn="1" w:lastColumn="0" w:noHBand="0" w:noVBand="1"/>
       </w:tblPr>
       <w:tblGrid>
@@ -2237,7 +2238,7 @@
                 <w:b/>
                 <w:sz w:val="20"/>
               </w:rPr>
-              <w:t>Approach</w:t>
+              <w:t>Published study</w:t>
             </w:r>
           </w:p>
         </w:tc>
@@ -2262,7 +2263,7 @@
                 <w:b/>
                 <w:sz w:val="20"/>
               </w:rPr>
-              <w:t>Useful evidence</w:t>
+              <w:t>Relevant method</w:t>
             </w:r>
           </w:p>
         </w:tc>
@@ -2300,69 +2301,51 @@
         <w:tc>
           <w:tcPr>
             <w:tcW w:w="1800" w:type="dxa"/>
-            <w:tcMar>
-              <w:top w:w="85" w:type="dxa"/>
-              <w:left w:w="85" w:type="dxa"/>
-              <w:bottom w:w="85" w:type="dxa"/>
-              <w:right w:w="85" w:type="dxa"/>
-            </w:tcMar>
-            <w:vAlign w:val="center"/>
-          </w:tcPr>
-          <w:p>
-            <w:pPr>
-              <w:spacing w:after="40" w:line="252" w:lineRule="auto"/>
-            </w:pPr>
-            <w:r>
-              <w:rPr>
-                <w:sz w:val="20"/>
-              </w:rPr>
-              <w:t>Ordinary request / ping</w:t>
+            <w:vAlign w:val="center"/>
+          </w:tcPr>
+          <w:p>
+            <w:pPr>
+              <w:spacing w:after="40" w:line="252" w:lineRule="auto"/>
+            </w:pPr>
+            <w:r>
+              <w:rPr>
+                <w:sz w:val="20"/>
+              </w:rPr>
+              <w:t>Basiri et al. [1]</w:t>
             </w:r>
           </w:p>
         </w:tc>
         <w:tc>
           <w:tcPr>
             <w:tcW w:w="3168" w:type="dxa"/>
-            <w:tcMar>
-              <w:top w:w="85" w:type="dxa"/>
-              <w:left w:w="85" w:type="dxa"/>
-              <w:bottom w:w="85" w:type="dxa"/>
-              <w:right w:w="85" w:type="dxa"/>
-            </w:tcMar>
-            <w:vAlign w:val="center"/>
-          </w:tcPr>
-          <w:p>
-            <w:pPr>
-              <w:spacing w:after="40" w:line="252" w:lineRule="auto"/>
-            </w:pPr>
-            <w:r>
-              <w:rPr>
-                <w:sz w:val="20"/>
-              </w:rPr>
-              <w:t>Current completion or reachability</w:t>
+            <w:vAlign w:val="center"/>
+          </w:tcPr>
+          <w:p>
+            <w:pPr>
+              <w:spacing w:after="40" w:line="252" w:lineRule="auto"/>
+            </w:pPr>
+            <w:r>
+              <w:rPr>
+                <w:sz w:val="20"/>
+              </w:rPr>
+              <w:t>Hypotheses and observable steady-state behavior</w:t>
             </w:r>
           </w:p>
         </w:tc>
         <w:tc>
           <w:tcPr>
             <w:tcW w:w="4176" w:type="dxa"/>
-            <w:tcMar>
-              <w:top w:w="85" w:type="dxa"/>
-              <w:left w:w="85" w:type="dxa"/>
-              <w:bottom w:w="85" w:type="dxa"/>
-              <w:right w:w="85" w:type="dxa"/>
-            </w:tcMar>
-            <w:vAlign w:val="center"/>
-          </w:tcPr>
-          <w:p>
-            <w:pPr>
-              <w:spacing w:after="40" w:line="252" w:lineRule="auto"/>
-            </w:pPr>
-            <w:r>
-              <w:rPr>
-                <w:sz w:val="20"/>
-              </w:rPr>
-              <w:t>Does not independently impose the selected HTTP fault.</w:t>
+            <w:vAlign w:val="center"/>
+          </w:tcPr>
+          <w:p>
+            <w:pPr>
+              <w:spacing w:after="40" w:line="252" w:lineRule="auto"/>
+            </w:pPr>
+            <w:r>
+              <w:rPr>
+                <w:sz w:val="20"/>
+              </w:rPr>
+              <w:t>Local baseline/fault/recovery comparison with explicit HTTP outcomes.</w:t>
             </w:r>
           </w:p>
         </w:tc>
@@ -2375,69 +2358,51 @@
         <w:tc>
           <w:tcPr>
             <w:tcW w:w="1800" w:type="dxa"/>
-            <w:tcMar>
-              <w:top w:w="85" w:type="dxa"/>
-              <w:left w:w="85" w:type="dxa"/>
-              <w:bottom w:w="85" w:type="dxa"/>
-              <w:right w:w="85" w:type="dxa"/>
-            </w:tcMar>
-            <w:vAlign w:val="center"/>
-          </w:tcPr>
-          <w:p>
-            <w:pPr>
-              <w:spacing w:after="40" w:line="252" w:lineRule="auto"/>
-            </w:pPr>
-            <w:r>
-              <w:rPr>
-                <w:sz w:val="20"/>
-              </w:rPr>
-              <w:t>Toxiproxy</w:t>
+            <w:vAlign w:val="center"/>
+          </w:tcPr>
+          <w:p>
+            <w:pPr>
+              <w:spacing w:after="40" w:line="252" w:lineRule="auto"/>
+            </w:pPr>
+            <w:r>
+              <w:rPr>
+                <w:sz w:val="20"/>
+              </w:rPr>
+              <w:t>Alvaro et al. [2]</w:t>
             </w:r>
           </w:p>
         </w:tc>
         <w:tc>
           <w:tcPr>
             <w:tcW w:w="3168" w:type="dxa"/>
-            <w:tcMar>
-              <w:top w:w="85" w:type="dxa"/>
-              <w:left w:w="85" w:type="dxa"/>
-              <w:bottom w:w="85" w:type="dxa"/>
-              <w:right w:w="85" w:type="dxa"/>
-            </w:tcMar>
-            <w:vAlign w:val="center"/>
-          </w:tcPr>
-          <w:p>
-            <w:pPr>
-              <w:spacing w:after="40" w:line="252" w:lineRule="auto"/>
-            </w:pPr>
-            <w:r>
-              <w:rPr>
-                <w:sz w:val="20"/>
-              </w:rPr>
-              <w:t>Established TCP fault injection</w:t>
+            <w:vAlign w:val="center"/>
+          </w:tcPr>
+          <w:p>
+            <w:pPr>
+              <w:spacing w:after="40" w:line="252" w:lineRule="auto"/>
+            </w:pPr>
+            <w:r>
+              <w:rPr>
+                <w:sz w:val="20"/>
+              </w:rPr>
+              <w:t>Outcome-guided failure selection using lineage</w:t>
             </w:r>
           </w:p>
         </w:tc>
         <w:tc>
           <w:tcPr>
             <w:tcW w:w="4176" w:type="dxa"/>
-            <w:tcMar>
-              <w:top w:w="85" w:type="dxa"/>
-              <w:left w:w="85" w:type="dxa"/>
-              <w:bottom w:w="85" w:type="dxa"/>
-              <w:right w:w="85" w:type="dxa"/>
-            </w:tcMar>
-            <w:vAlign w:val="center"/>
-          </w:tcPr>
-          <w:p>
-            <w:pPr>
-              <w:spacing w:after="40" w:line="252" w:lineRule="auto"/>
-            </w:pPr>
-            <w:r>
-              <w:rPr>
-                <w:sz w:val="20"/>
-              </w:rPr>
-              <w:t>Related prior tool; no comparative execution-speed claim.</w:t>
+            <w:vAlign w:val="center"/>
+          </w:tcPr>
+          <w:p>
+            <w:pPr>
+              <w:spacing w:after="40" w:line="252" w:lineRule="auto"/>
+            </w:pPr>
+            <w:r>
+              <w:rPr>
+                <w:sz w:val="20"/>
+              </w:rPr>
+              <w:t>Fixed configured scenarios; no automatic lineage or completeness guarantee.</w:t>
             </w:r>
           </w:p>
         </w:tc>
@@ -2450,69 +2415,51 @@
         <w:tc>
           <w:tcPr>
             <w:tcW w:w="1800" w:type="dxa"/>
-            <w:tcMar>
-              <w:top w:w="85" w:type="dxa"/>
-              <w:left w:w="85" w:type="dxa"/>
-              <w:bottom w:w="85" w:type="dxa"/>
-              <w:right w:w="85" w:type="dxa"/>
-            </w:tcMar>
-            <w:vAlign w:val="center"/>
-          </w:tcPr>
-          <w:p>
-            <w:pPr>
-              <w:spacing w:after="40" w:line="252" w:lineRule="auto"/>
-            </w:pPr>
-            <w:r>
-              <w:rPr>
-                <w:sz w:val="20"/>
-              </w:rPr>
-              <w:t>Wireshark</w:t>
+            <w:vAlign w:val="center"/>
+          </w:tcPr>
+          <w:p>
+            <w:pPr>
+              <w:spacing w:after="40" w:line="252" w:lineRule="auto"/>
+            </w:pPr>
+            <w:r>
+              <w:rPr>
+                <w:sz w:val="20"/>
+              </w:rPr>
+              <w:t>Carbone and Rizzo [3]</w:t>
             </w:r>
           </w:p>
         </w:tc>
         <w:tc>
           <w:tcPr>
             <w:tcW w:w="3168" w:type="dxa"/>
-            <w:tcMar>
-              <w:top w:w="85" w:type="dxa"/>
-              <w:left w:w="85" w:type="dxa"/>
-              <w:bottom w:w="85" w:type="dxa"/>
-              <w:right w:w="85" w:type="dxa"/>
-            </w:tcMar>
-            <w:vAlign w:val="center"/>
-          </w:tcPr>
-          <w:p>
-            <w:pPr>
-              <w:spacing w:after="40" w:line="252" w:lineRule="auto"/>
-            </w:pPr>
-            <w:r>
-              <w:rPr>
-                <w:sz w:val="20"/>
-              </w:rPr>
-              <w:t>Packets, protocol contents and timings</w:t>
+            <w:vAlign w:val="center"/>
+          </w:tcPr>
+          <w:p>
+            <w:pPr>
+              <w:spacing w:after="40" w:line="252" w:lineRule="auto"/>
+            </w:pPr>
+            <w:r>
+              <w:rPr>
+                <w:sz w:val="20"/>
+              </w:rPr>
+              <w:t>Controlled link emulation and accuracy assessment</w:t>
             </w:r>
           </w:p>
         </w:tc>
         <w:tc>
           <w:tcPr>
             <w:tcW w:w="4176" w:type="dxa"/>
-            <w:tcMar>
-              <w:top w:w="85" w:type="dxa"/>
-              <w:left w:w="85" w:type="dxa"/>
-              <w:bottom w:w="85" w:type="dxa"/>
-              <w:right w:w="85" w:type="dxa"/>
-            </w:tcMar>
-            <w:vAlign w:val="center"/>
-          </w:tcPr>
-          <w:p>
-            <w:pPr>
-              <w:spacing w:after="40" w:line="252" w:lineRule="auto"/>
-            </w:pPr>
-            <w:r>
-              <w:rPr>
-                <w:sz w:val="20"/>
-              </w:rPr>
-              <w:t>Independent observer of FaultNet traffic.</w:t>
+            <w:vAlign w:val="center"/>
+          </w:tcPr>
+          <w:p>
+            <w:pPr>
+              <w:spacing w:after="40" w:line="252" w:lineRule="auto"/>
+            </w:pPr>
+            <w:r>
+              <w:rPr>
+                <w:sz w:val="20"/>
+              </w:rPr>
+              <w:t>Calibrate user-space HTTP delay/pacing; distinguish the injection layer.</w:t>
             </w:r>
           </w:p>
         </w:tc>
@@ -2525,69 +2472,51 @@
         <w:tc>
           <w:tcPr>
             <w:tcW w:w="1800" w:type="dxa"/>
-            <w:tcMar>
-              <w:top w:w="85" w:type="dxa"/>
-              <w:left w:w="85" w:type="dxa"/>
-              <w:bottom w:w="85" w:type="dxa"/>
-              <w:right w:w="85" w:type="dxa"/>
-            </w:tcMar>
-            <w:vAlign w:val="center"/>
-          </w:tcPr>
-          <w:p>
-            <w:pPr>
-              <w:spacing w:after="40" w:line="252" w:lineRule="auto"/>
-            </w:pPr>
-            <w:r>
-              <w:rPr>
-                <w:sz w:val="20"/>
-              </w:rPr>
-              <w:t>Packet Tracer</w:t>
+            <w:vAlign w:val="center"/>
+          </w:tcPr>
+          <w:p>
+            <w:pPr>
+              <w:spacing w:after="40" w:line="252" w:lineRule="auto"/>
+            </w:pPr>
+            <w:r>
+              <w:rPr>
+                <w:sz w:val="20"/>
+              </w:rPr>
+              <w:t>Paxson [4]</w:t>
             </w:r>
           </w:p>
         </w:tc>
         <w:tc>
           <w:tcPr>
             <w:tcW w:w="3168" w:type="dxa"/>
-            <w:tcMar>
-              <w:top w:w="85" w:type="dxa"/>
-              <w:left w:w="85" w:type="dxa"/>
-              <w:bottom w:w="85" w:type="dxa"/>
-              <w:right w:w="85" w:type="dxa"/>
-            </w:tcMar>
-            <w:vAlign w:val="center"/>
-          </w:tcPr>
-          <w:p>
-            <w:pPr>
-              <w:spacing w:after="40" w:line="252" w:lineRule="auto"/>
-            </w:pPr>
-            <w:r>
-              <w:rPr>
-                <w:sz w:val="20"/>
-              </w:rPr>
-              <w:t>Simulated routing and link-failure behavior</w:t>
+            <w:vAlign w:val="center"/>
+          </w:tcPr>
+          <w:p>
+            <w:pPr>
+              <w:spacing w:after="40" w:line="252" w:lineRule="auto"/>
+            </w:pPr>
+            <w:r>
+              <w:rPr>
+                <w:sz w:val="20"/>
+              </w:rPr>
+              <w:t>Trace-based analysis separating network and TCP effects</w:t>
             </w:r>
           </w:p>
         </w:tc>
         <w:tc>
           <w:tcPr>
             <w:tcW w:w="4176" w:type="dxa"/>
-            <w:tcMar>
-              <w:top w:w="85" w:type="dxa"/>
-              <w:left w:w="85" w:type="dxa"/>
-              <w:bottom w:w="85" w:type="dxa"/>
-              <w:right w:w="85" w:type="dxa"/>
-            </w:tcMar>
-            <w:vAlign w:val="center"/>
-          </w:tcPr>
-          <w:p>
-            <w:pPr>
-              <w:spacing w:after="40" w:line="252" w:lineRule="auto"/>
-            </w:pPr>
-            <w:r>
-              <w:rPr>
-                <w:sz w:val="20"/>
-              </w:rPr>
-              <w:t>Separate network-layer demonstration.</w:t>
+            <w:vAlign w:val="center"/>
+          </w:tcPr>
+          <w:p>
+            <w:pPr>
+              <w:spacing w:after="40" w:line="252" w:lineRule="auto"/>
+            </w:pPr>
+            <w:r>
+              <w:rPr>
+                <w:sz w:val="20"/>
+              </w:rPr>
+              <w:t>Correlate streams with probes; distinguish elapsed time, RTT and loss.</w:t>
             </w:r>
           </w:p>
         </w:tc>
@@ -2600,69 +2529,108 @@
         <w:tc>
           <w:tcPr>
             <w:tcW w:w="1800" w:type="dxa"/>
-            <w:tcMar>
-              <w:top w:w="85" w:type="dxa"/>
-              <w:left w:w="85" w:type="dxa"/>
-              <w:bottom w:w="85" w:type="dxa"/>
-              <w:right w:w="85" w:type="dxa"/>
-            </w:tcMar>
-            <w:vAlign w:val="center"/>
-          </w:tcPr>
-          <w:p>
-            <w:pPr>
-              <w:spacing w:after="40" w:line="252" w:lineRule="auto"/>
-            </w:pPr>
-            <w:r>
-              <w:rPr>
-                <w:sz w:val="20"/>
-              </w:rPr>
-              <w:t>FaultNet</w:t>
+            <w:vAlign w:val="center"/>
+          </w:tcPr>
+          <w:p>
+            <w:pPr>
+              <w:spacing w:after="40" w:line="252" w:lineRule="auto"/>
+            </w:pPr>
+            <w:r>
+              <w:rPr>
+                <w:sz w:val="20"/>
+              </w:rPr>
+              <w:t>Lantz et al. [5]</w:t>
             </w:r>
           </w:p>
         </w:tc>
         <w:tc>
           <w:tcPr>
             <w:tcW w:w="3168" w:type="dxa"/>
-            <w:tcMar>
-              <w:top w:w="85" w:type="dxa"/>
-              <w:left w:w="85" w:type="dxa"/>
-              <w:bottom w:w="85" w:type="dxa"/>
-              <w:right w:w="85" w:type="dxa"/>
-            </w:tcMar>
-            <w:vAlign w:val="center"/>
-          </w:tcPr>
-          <w:p>
-            <w:pPr>
-              <w:spacing w:after="40" w:line="252" w:lineRule="auto"/>
-            </w:pPr>
-            <w:r>
-              <w:rPr>
-                <w:sz w:val="20"/>
-              </w:rPr>
-              <w:t>Configured faults, phase statistics and saved records</w:t>
+            <w:vAlign w:val="center"/>
+          </w:tcPr>
+          <w:p>
+            <w:pPr>
+              <w:spacing w:after="40" w:line="252" w:lineRule="auto"/>
+            </w:pPr>
+            <w:r>
+              <w:rPr>
+                <w:sz w:val="20"/>
+              </w:rPr>
+              <w:t>Interactive virtual-network prototyping</w:t>
             </w:r>
           </w:p>
         </w:tc>
         <w:tc>
           <w:tcPr>
             <w:tcW w:w="4176" w:type="dxa"/>
-            <w:tcMar>
-              <w:top w:w="85" w:type="dxa"/>
-              <w:left w:w="85" w:type="dxa"/>
-              <w:bottom w:w="85" w:type="dxa"/>
-              <w:right w:w="85" w:type="dxa"/>
-            </w:tcMar>
-            <w:vAlign w:val="center"/>
-          </w:tcPr>
-          <w:p>
-            <w:pPr>
-              <w:spacing w:after="40" w:line="252" w:lineRule="auto"/>
-            </w:pPr>
-            <w:r>
-              <w:rPr>
-                <w:sz w:val="20"/>
-              </w:rPr>
-              <w:t>Combines controlled HTTP execution with inspectable evidence.</w:t>
+            <w:vAlign w:val="center"/>
+          </w:tcPr>
+          <w:p>
+            <w:pPr>
+              <w:spacing w:after="40" w:line="252" w:lineRule="auto"/>
+            </w:pPr>
+            <w:r>
+              <w:rPr>
+                <w:sz w:val="20"/>
+              </w:rPr>
+              <w:t>Keep real HTTP traffic and simulated routing evidence separate.</w:t>
+            </w:r>
+          </w:p>
+        </w:tc>
+      </w:tr>
+      <w:tr>
+        <w:trPr>
+          <w:cantSplit/>
+          <w:jc w:val="center"/>
+        </w:trPr>
+        <w:tc>
+          <w:tcPr>
+            <w:tcW w:w="1800" w:type="dxa"/>
+            <w:vAlign w:val="center"/>
+          </w:tcPr>
+          <w:p>
+            <w:pPr>
+              <w:spacing w:after="40" w:line="252" w:lineRule="auto"/>
+            </w:pPr>
+            <w:r>
+              <w:rPr>
+                <w:sz w:val="20"/>
+              </w:rPr>
+              <w:t>Handigol et al. [6]</w:t>
+            </w:r>
+          </w:p>
+        </w:tc>
+        <w:tc>
+          <w:tcPr>
+            <w:tcW w:w="3168" w:type="dxa"/>
+            <w:vAlign w:val="center"/>
+          </w:tcPr>
+          <w:p>
+            <w:pPr>
+              <w:spacing w:after="40" w:line="252" w:lineRule="auto"/>
+            </w:pPr>
+            <w:r>
+              <w:rPr>
+                <w:sz w:val="20"/>
+              </w:rPr>
+              <w:t>Reproducible emulation with resource controls</w:t>
+            </w:r>
+          </w:p>
+        </w:tc>
+        <w:tc>
+          <w:tcPr>
+            <w:tcW w:w="4176" w:type="dxa"/>
+            <w:vAlign w:val="center"/>
+          </w:tcPr>
+          <w:p>
+            <w:pPr>
+              <w:spacing w:after="40" w:line="252" w:lineRule="auto"/>
+            </w:pPr>
+            <w:r>
+              <w:rPr>
+                <w:sz w:val="20"/>
+              </w:rPr>
+              <w:t>Preserve settings and analysis while disclosing the shared-host environment.</w:t>
             </w:r>
           </w:p>
         </w:tc>
@@ -2670,7 +2638,6 @@
     </w:tbl>
     <w:p>
       <w:pPr>
-        <w:spacing w:after="40" w:line="240" w:lineRule="auto"/>
         <w:jc w:val="both"/>
       </w:pPr>
     </w:p>
@@ -2679,7 +2646,7 @@
         <w:pStyle w:val="Heading1"/>
         <w:pageBreakBefore/>
       </w:pPr>
-      <w:bookmarkStart w:id="5" w:name="_Toc244027342"/>
+      <w:bookmarkStart w:id="5" w:name="_Toc244031155"/>
       <w:r>
         <w:lastRenderedPageBreak/>
         <w:t>5. Abstract</w:t>
@@ -2691,13 +2658,7 @@
         <w:jc w:val="both"/>
       </w:pPr>
       <w:r>
-        <w:t>FaultNet is a local HTTP resilience-testing system that combines automated experiments with manual development-proxy controls. The workbench coordinates baseline, faulty and recovery phases against a fixed 64 KiB response, validates observations and saves JSON evidence. The evaluation comprises 100 workbench runs with 1300 phase observations, 100 direct/proxy calibration requests and 80 live-proxy samples. Ten repeated runs are used per workbench configuration. The 1,500 ms delay condition adds a median 1,5</w:t>
-      </w:r>
-      <w:r>
-        <w:t>06.52 ms relative to matching baselines. At 16 KiB/s, observed payload goodput is 15.96 KiB/s, while the 128 KiB/s condition attains 61.81% of its configured rate. Increasing timeout from 500 to 2,000 ms under a fixed 1,000 ms delay changes faulty completion from 0% to 100%. Packet timings provide independent traffic evidence. Reviewed routing cases show that RIP and OSPF use the alternate path after the tested direct-link failure, whereas the static control lacks a backup route. The findings support contro</w:t>
-      </w:r>
-      <w:r>
-        <w:t>lled local fault testing and expose platform-dependent pacing limitations.</w:t>
+        <w:t>FaultNet is a local HTTP resilience-testing system that combines automated experiments with manual development-proxy controls. The workbench coordinates baseline, faulty and recovery phases against a fixed 64 KiB response, validates observations and saves JSON evidence. The evaluation comprises 100 workbench runs with 1300 phase observations, 100 direct/proxy calibration requests and 80 live-proxy samples. Ten repeated runs are used per workbench configuration. The 1,500 ms delay condition adds a median 1,506.52 ms relative to matching baselines. At 16 KiB/s, observed payload goodput is 15.96 KiB/s, while the 128 KiB/s condition attains 61.81% of its configured rate. Increasing timeout from 500 to 2,000 ms under a fixed 1,000 ms delay changes faulty completion from 0% to 100%. Packet timings provide independent traffic evidence. Reviewed routing cases show that RIP and OSPF use the alternate path after the tested direct-link failure, whereas the static control lacks a backup route. The findings support controlled local fault testing and expose platform-dependent pacing limitations.</w:t>
       </w:r>
     </w:p>
     <w:p>
@@ -2705,7 +2666,7 @@
         <w:pStyle w:val="Heading1"/>
         <w:pageBreakBefore/>
       </w:pPr>
-      <w:bookmarkStart w:id="6" w:name="_Toc244027343"/>
+      <w:bookmarkStart w:id="6" w:name="_Toc244031156"/>
       <w:r>
         <w:lastRenderedPageBreak/>
         <w:t>6. Workflow of the Proposed Project work and System Architecture</w:t>
@@ -3160,7 +3121,7 @@
           <w:noProof/>
         </w:rPr>
         <w:drawing>
-          <wp:inline distT="0" distB="0" distL="0" distR="0" wp14:anchorId="02AFF533" wp14:editId="335E5974">
+          <wp:inline distT="0" distB="0" distL="0" distR="0" wp14:anchorId="67552657" wp14:editId="48ACBFC1">
             <wp:extent cx="5577840" cy="3022829"/>
             <wp:effectExtent l="0" t="0" r="0" b="0"/>
             <wp:docPr id="2" name="Picture 2" descr="Control and data paths in FaultNet. The workbench and live proxy have independent fault configurations; replies return through the same proxy path."/>
@@ -3220,7 +3181,7 @@
       <w:pPr>
         <w:pStyle w:val="Heading2"/>
       </w:pPr>
-      <w:bookmarkStart w:id="7" w:name="_Toc244027344"/>
+      <w:bookmarkStart w:id="7" w:name="_Toc244031157"/>
       <w:r>
         <w:lastRenderedPageBreak/>
         <w:t>6.1 Dashboard Roles and Separation</w:t>
@@ -3736,7 +3697,7 @@
       <w:pPr>
         <w:pStyle w:val="Heading2"/>
       </w:pPr>
-      <w:bookmarkStart w:id="8" w:name="_Toc244027345"/>
+      <w:bookmarkStart w:id="8" w:name="_Toc244031158"/>
       <w:r>
         <w:t>6.2 Workbench Functions and Fault Mechanisms</w:t>
       </w:r>
@@ -4121,7 +4082,7 @@
       <w:pPr>
         <w:pStyle w:val="Heading2"/>
       </w:pPr>
-      <w:bookmarkStart w:id="9" w:name="_Toc244027346"/>
+      <w:bookmarkStart w:id="9" w:name="_Toc244031159"/>
       <w:r>
         <w:t>6.3 Live Proxy Cockpit Functions</w:t>
       </w:r>
@@ -4556,7 +4517,7 @@
         <w:pStyle w:val="Heading1"/>
         <w:pageBreakBefore/>
       </w:pPr>
-      <w:bookmarkStart w:id="10" w:name="_Toc244027347"/>
+      <w:bookmarkStart w:id="10" w:name="_Toc244031160"/>
       <w:r>
         <w:lastRenderedPageBreak/>
         <w:t>7. Contribution of Individual Team Member</w:t>
@@ -4847,7 +4808,7 @@
       <w:pPr>
         <w:pStyle w:val="Heading1"/>
       </w:pPr>
-      <w:bookmarkStart w:id="11" w:name="_Toc244027348"/>
+      <w:bookmarkStart w:id="11" w:name="_Toc244031161"/>
       <w:r>
         <w:t>8. Modules Explanation</w:t>
       </w:r>
@@ -5526,7 +5487,7 @@
         <w:pStyle w:val="Heading1"/>
         <w:pageBreakBefore/>
       </w:pPr>
-      <w:bookmarkStart w:id="12" w:name="_Toc244027349"/>
+      <w:bookmarkStart w:id="12" w:name="_Toc244031162"/>
       <w:r>
         <w:lastRenderedPageBreak/>
         <w:t>9. Project Implementation</w:t>
@@ -5537,7 +5498,7 @@
       <w:pPr>
         <w:pStyle w:val="Heading2"/>
       </w:pPr>
-      <w:bookmarkStart w:id="13" w:name="_Toc244027350"/>
+      <w:bookmarkStart w:id="13" w:name="_Toc244031163"/>
       <w:r>
         <w:t>9.1 Experimental Setup with Hardware and Software Requirements</w:t>
       </w:r>
@@ -5556,7 +5517,7 @@
         <w:jc w:val="both"/>
       </w:pPr>
       <w:r>
-        <w:t>The application source baseline is commit 313822e in the project repository. Measurement and report scripts are maintained separately from the application modules. Repeating an evaluation must preserve the recorded settings and runtime; a different laptop or source revision can legitimately produce different timings.</w:t>
+        <w:t>The application source baseline is commit 313822e in the project repository. Measurement and report scripts are maintained separately from the application modules. The emphasis on recording a repeatable setup is consistent with the reproducibility concerns studied by Handigol et al. [6]. A different laptop or source revision can legitimately produce different timings; comparisons must retain the recorded settings and runtime.</w:t>
       </w:r>
     </w:p>
     <w:p>
@@ -6102,7 +6063,7 @@
         <w:pStyle w:val="Heading2"/>
         <w:pageBreakBefore/>
       </w:pPr>
-      <w:bookmarkStart w:id="14" w:name="_Toc244027351"/>
+      <w:bookmarkStart w:id="14" w:name="_Toc244031164"/>
       <w:r>
         <w:lastRenderedPageBreak/>
         <w:t>9.2 Test Cases</w:t>
@@ -6718,7 +6679,7 @@
         <w:pStyle w:val="Heading2"/>
         <w:pageBreakBefore/>
       </w:pPr>
-      <w:bookmarkStart w:id="15" w:name="_Toc244027352"/>
+      <w:bookmarkStart w:id="15" w:name="_Toc244031165"/>
       <w:r>
         <w:lastRenderedPageBreak/>
         <w:t>9.3 Results of Execution and Screenshots</w:t>
@@ -6738,10 +6699,7 @@
         <w:jc w:val="both"/>
       </w:pPr>
       <w:r>
-        <w:t>Record quality is reported separately from request success. There were 101 attempted workbench runs: 100 supplied validated terminal records and 1 failed record validation. In the rejected bandwidth trial, UTC recovery duration and elapsed-clock duration differed by 2.38 ms, above the validator's 2 ms tolerance. The retained rejected record is excluded from timing aggregation and the condition is repeated to preserve the ten-run design. Thus 100 accepted runs do not imply that every attempted record was sav</w:t>
-      </w:r>
-      <w:r>
-        <w:t>ed successfully.</w:t>
+        <w:t>Record quality is reported separately from request success. There were 101 attempted workbench runs: 100 supplied validated terminal records and 1 failed record validation. In the rejected bandwidth trial, UTC recovery duration and elapsed-clock duration differed by 2.38 ms, above the validator's 2 ms tolerance. The retained rejected record is excluded from timing aggregation and the condition is repeated to preserve the ten-run design. Thus 100 accepted runs do not imply that every attempted record was saved successfully.</w:t>
       </w:r>
     </w:p>
     <w:p>
@@ -6754,7 +6712,7 @@
           <w:noProof/>
         </w:rPr>
         <w:drawing>
-          <wp:inline distT="0" distB="0" distL="0" distR="0" wp14:anchorId="459A8C43" wp14:editId="5503BE01">
+          <wp:inline distT="0" distB="0" distL="0" distR="0" wp14:anchorId="26453B63" wp14:editId="49040A80">
             <wp:extent cx="5577840" cy="3487618"/>
             <wp:effectExtent l="0" t="0" r="0" b="0"/>
             <wp:docPr id="3" name="Picture 3" descr="Representative workbench interface showing settings, phase comparisons, successful timing and recovery evidence. Displayed example values are not the repeated-study aggregate."/>
@@ -8213,7 +8171,7 @@
         <w:pStyle w:val="Heading2"/>
         <w:pageBreakBefore/>
       </w:pPr>
-      <w:bookmarkStart w:id="16" w:name="_Toc244027353"/>
+      <w:bookmarkStart w:id="16" w:name="_Toc244031166"/>
       <w:r>
         <w:lastRenderedPageBreak/>
         <w:t>9.4 Performance Analysis and Comparison of Methods</w:t>
@@ -8680,7 +8638,7 @@
           <w:noProof/>
         </w:rPr>
         <w:drawing>
-          <wp:inline distT="0" distB="0" distL="0" distR="0" wp14:anchorId="0B9D1A23" wp14:editId="2500682A">
+          <wp:inline distT="0" distB="0" distL="0" distR="0" wp14:anchorId="3B13998E" wp14:editId="79F6BA3E">
             <wp:extent cx="5577840" cy="3003728"/>
             <wp:effectExtent l="0" t="0" r="0" b="0"/>
             <wp:docPr id="4" name="Picture 4" descr="Configured delay versus paired measured increase. Error bars are exploratory bootstrap intervals across ten runs."/>
@@ -8747,7 +8705,7 @@
         </w:rPr>
         <w:lastRenderedPageBreak/>
         <w:drawing>
-          <wp:inline distT="0" distB="0" distL="0" distR="0" wp14:anchorId="1BA8D69F" wp14:editId="373E508D">
+          <wp:inline distT="0" distB="0" distL="0" distR="0" wp14:anchorId="0953DEAD" wp14:editId="719259F4">
             <wp:extent cx="5577840" cy="3001801"/>
             <wp:effectExtent l="0" t="0" r="0" b="0"/>
             <wp:docPr id="5" name="Picture 5" descr="Empirical distributions of successful faulty response times; 50 observations per configured delay. Curves show separation and within-condition variation."/>
@@ -9360,7 +9318,7 @@
           <w:noProof/>
         </w:rPr>
         <w:drawing>
-          <wp:inline distT="0" distB="0" distL="0" distR="0" wp14:anchorId="6CA5134D" wp14:editId="13E26843">
+          <wp:inline distT="0" distB="0" distL="0" distR="0" wp14:anchorId="1691CDF2" wp14:editId="72966A65">
             <wp:extent cx="5577840" cy="3001801"/>
             <wp:effectExtent l="0" t="0" r="0" b="0"/>
             <wp:docPr id="6" name="Picture 6" descr="Measured whole-request goodput versus configured restriction for the same 64 KiB payload."/>
@@ -9413,10 +9371,7 @@
         <w:jc w:val="both"/>
       </w:pPr>
       <w:r>
-        <w:t xml:space="preserve">The 16 KiB/s condition attained 99.75% of its configured rate. The 128 KiB/s condition attained 61.81%, so the implementation should be interpreted as a delivery cap rather than a guarantee of exact target throughput. The 1 KiB schedule has nominal chunk intervals of 62.5, 31.25 and 7.8125 ms at 16, 32 and 128 KiB/s respectively. At short waits, timer dispatch and local scheduling can consume a larger fraction of the interval. This is a plausible explanation consistent with the mechanism; timer causes were </w:t>
-      </w:r>
-      <w:r>
-        <w:t>not independently isolated.</w:t>
+        <w:t>The 16 KiB/s condition attained 99.75% of its configured rate. The 128 KiB/s condition attained 61.81%, so the implementation should be interpreted as a delivery cap rather than a guarantee of exact target throughput. The 1 KiB schedule has nominal chunk intervals of 62.5, 31.25 and 7.8125 ms at 16, 32 and 128 KiB/s respectively. At short waits, timer dispatch and local scheduling can consume a larger fraction of the interval. This is a plausible explanation consistent with the mechanism; timer causes were not independently isolated.</w:t>
       </w:r>
     </w:p>
     <w:p>
@@ -9447,7 +9402,7 @@
           <w:noProof/>
         </w:rPr>
         <w:drawing>
-          <wp:inline distT="0" distB="0" distL="0" distR="0" wp14:anchorId="6FC68C68" wp14:editId="2F056938">
+          <wp:inline distT="0" distB="0" distL="0" distR="0" wp14:anchorId="0F7C8859" wp14:editId="37878849">
             <wp:extent cx="5577840" cy="2833643"/>
             <wp:effectExtent l="0" t="0" r="0" b="0"/>
             <wp:docPr id="7" name="Picture 7" descr="Fixed 1,000 ms injected delay with two client deadlines. The duration panel distinguishes failed waiting time from successful response latency."/>
@@ -9539,7 +9494,7 @@
           <w:noProof/>
         </w:rPr>
         <w:drawing>
-          <wp:inline distT="0" distB="0" distL="0" distR="0" wp14:anchorId="7DA2517F" wp14:editId="571D7244">
+          <wp:inline distT="0" distB="0" distL="0" distR="0" wp14:anchorId="65843D12" wp14:editId="1D27D29A">
             <wp:extent cx="5577840" cy="3087669"/>
             <wp:effectExtent l="0" t="0" r="0" b="0"/>
             <wp:docPr id="8" name="Picture 8" descr="Baseline and recovered successful response times for each condition. Recovery phase medians and confirmation duration are distinct metrics."/>
@@ -10351,7 +10306,7 @@
           <w:noProof/>
         </w:rPr>
         <w:drawing>
-          <wp:inline distT="0" distB="0" distL="0" distR="0" wp14:anchorId="1FB581BB" wp14:editId="113EB369">
+          <wp:inline distT="0" distB="0" distL="0" distR="0" wp14:anchorId="1BC7297A" wp14:editId="428EE465">
             <wp:extent cx="5577840" cy="2915933"/>
             <wp:effectExtent l="0" t="0" r="0" b="0"/>
             <wp:docPr id="9" name="Picture 9" descr="Live sample durations under normal, delayed, jittered and rate-restricted configurations; ten requests per condition."/>
@@ -12027,7 +11982,7 @@
           <w:noProof/>
         </w:rPr>
         <w:drawing>
-          <wp:inline distT="0" distB="0" distL="0" distR="0" wp14:anchorId="2D7579C5" wp14:editId="0ECD3E01">
+          <wp:inline distT="0" distB="0" distL="0" distR="0" wp14:anchorId="7EDCBD92" wp14:editId="756183CB">
             <wp:extent cx="5577840" cy="3172486"/>
             <wp:effectExtent l="0" t="0" r="0" b="0"/>
             <wp:docPr id="10" name="Picture 10" descr="Measured request and response timing extracted with TShark from the loopback capture. This is an analytical packet view, not a simulated Wireshark screenshot."/>
@@ -12080,7 +12035,7 @@
         <w:jc w:val="both"/>
       </w:pPr>
       <w:r>
-        <w:t>Wireshark may label the final reassembly packet as the HTTP response even though response bytes began in an earlier segment [4]. Packet-derived intervals and application elapsed time therefore need not be numerically identical. Packet evidence is used as an independent consistency check, not as a reason to relabel application elapsed time as TCP acknowledgement RTT. Capture loss, if present, describes recording loss rather than the injected HTTP failure rate.</w:t>
+        <w:t>The matched streams distinguish first response data, the packet completing HTTP reconstruction and completion of the application's read. The measured intervals can therefore differ without contradiction. Stream matching supplies the local evidence for this distinction. Paxson's analysis motivates separating packet observations from transport effects [4]. Application elapsed time and reconstructed-response intervals measure different stages of an exchange; neither is TCP acknowledgement RTT. Capture loss describes recording loss and must be reported separately from injected HTTP failures.</w:t>
       </w:r>
     </w:p>
     <w:p>
@@ -12103,7 +12058,7 @@
           <w:noProof/>
         </w:rPr>
         <w:drawing>
-          <wp:inline distT="0" distB="0" distL="0" distR="0" wp14:anchorId="72D0721E" wp14:editId="41B6ED39">
+          <wp:inline distT="0" distB="0" distL="0" distR="0" wp14:anchorId="390A0965" wp14:editId="51172AE7">
             <wp:extent cx="5577840" cy="2824086"/>
             <wp:effectExtent l="0" t="0" r="0" b="0"/>
             <wp:docPr id="11" name="Picture 11" descr="Reviewed Packet Tracer topology with three routers, three switches and six PCs. The router triangle offers an alternate R1–R3–R2 path."/>
@@ -12612,7 +12567,7 @@
         </w:rPr>
         <w:lastRenderedPageBreak/>
         <w:drawing>
-          <wp:inline distT="0" distB="0" distL="0" distR="0" wp14:anchorId="21B77528" wp14:editId="16164405">
+          <wp:inline distT="0" distB="0" distL="0" distR="0" wp14:anchorId="00D5B724" wp14:editId="21DF7DAD">
             <wp:extent cx="5577840" cy="2915933"/>
             <wp:effectExtent l="0" t="0" r="0" b="0"/>
             <wp:docPr id="12" name="Picture 12" descr="Descriptive reachability comparison of reviewed four-ping batches. Bars are observations of this topology, not reliability estimates for each protocol."/>
@@ -12665,10 +12620,7 @@
         <w:jc w:val="both"/>
       </w:pPr>
       <w:r>
-        <w:t>Dynamic routing preserved reachability in the settled fault state of this topology, while the deliberately unprotected static configuration did not. Static routing can be configured with backup routes; the result is not a universal failure of static routing. Warm-up and restoration batches included transient losses. Fast Forward Time advanced the simulator, so the records do not support wall-clock convergence comparisons or a claim that OSPF was faster than RIP. Route selection, next hop and reachability es</w:t>
-      </w:r>
-      <w:r>
-        <w:t>tablish the demonstrated benefit.</w:t>
+        <w:t>Dynamic routing preserved reachability in the settled fault state of this topology, while the deliberately unprotected static configuration did not. Static routing can be configured with backup routes; the result is not a universal failure of static routing. Warm-up and restoration batches included transient losses. Fast Forward Time advanced the simulator, so the records do not support wall-clock convergence comparisons or a claim that OSPF was faster than RIP. Route selection, next hop and reachability establish the demonstrated benefit.</w:t>
       </w:r>
     </w:p>
     <w:p>
@@ -12676,7 +12628,7 @@
         <w:pStyle w:val="Heading2"/>
         <w:pageBreakBefore/>
       </w:pPr>
-      <w:bookmarkStart w:id="17" w:name="_Toc244027354"/>
+      <w:bookmarkStart w:id="17" w:name="_Toc244031167"/>
       <w:r>
         <w:lastRenderedPageBreak/>
         <w:t>9.5 Critical Evaluation and Optimization</w:t>
@@ -12720,7 +12672,7 @@
         <w:pStyle w:val="Heading1"/>
         <w:pageBreakBefore/>
       </w:pPr>
-      <w:bookmarkStart w:id="18" w:name="_Toc244027355"/>
+      <w:bookmarkStart w:id="18" w:name="_Toc244031168"/>
       <w:r>
         <w:lastRenderedPageBreak/>
         <w:t>10. Results and Discussion</w:t>
@@ -12731,7 +12683,7 @@
       <w:pPr>
         <w:pStyle w:val="Heading2"/>
       </w:pPr>
-      <w:bookmarkStart w:id="19" w:name="_Toc244027356"/>
+      <w:bookmarkStart w:id="19" w:name="_Toc244031169"/>
       <w:r>
         <w:t>10.1 Findings and Inferences</w:t>
       </w:r>
@@ -12773,7 +12725,7 @@
       <w:pPr>
         <w:pStyle w:val="Heading2"/>
       </w:pPr>
-      <w:bookmarkStart w:id="20" w:name="_Toc244027357"/>
+      <w:bookmarkStart w:id="20" w:name="_Toc244031170"/>
       <w:r>
         <w:t>10.2 Innovation Novelty and Evidence</w:t>
       </w:r>
@@ -12784,7 +12736,7 @@
         <w:jc w:val="both"/>
       </w:pPr>
       <w:r>
-        <w:t>The project's contribution is an inspectable local workflow: controlled fault settings, real requests, bounded execution, validated records, phase-specific analysis and a separate applied live configuration. Related tools establish proxy fault injection as prior art [3]. The contribution is integration and educational reproducibility, not a new routing protocol or a globally novel failure mechanism.</w:t>
+        <w:t>Published studies already establish deliberate fault experiments [1], outcome-guided fault selection [2] and controllable network emulation [3]. FaultNet's contribution is the integration of local HTTP fault settings, validated phase observations, saved evidence and a separate live development interface into an inspectable teaching workflow. The project does not claim a new fault-injection principle, routing protocol or performance advantage over these research systems. Its quantitative findings concern the measured FaultNet configuration.</w:t>
       </w:r>
     </w:p>
     <w:p>
@@ -12799,7 +12751,7 @@
       <w:pPr>
         <w:pStyle w:val="Heading1"/>
       </w:pPr>
-      <w:bookmarkStart w:id="21" w:name="_Toc244027358"/>
+      <w:bookmarkStart w:id="21" w:name="_Toc244031171"/>
       <w:r>
         <w:t>11. Conclusion</w:t>
       </w:r>
@@ -12810,17 +12762,14 @@
         <w:jc w:val="both"/>
       </w:pPr>
       <w:r>
-        <w:t>FaultNet implements controlled HTTP fault injection with saved experiments and a separate live development cockpit. A repeated evaluation of 100 workbench runs supports measurable delay, pacing, failure and restoration behavior. The timeout comparison improves observed completion from 0% to 100% by permitting longer waiting, while the high-rate pacing result exposes a concrete limitation. Packet analysis and reviewed routing observations provide complementary evidence. The system is useful for local develop</w:t>
-      </w:r>
-      <w:r>
-        <w:t>ment testing and networking education because configurations, measurements and explanations can be examined together.</w:t>
+        <w:t>FaultNet implements controlled HTTP fault injection with saved experiments and a separate live development cockpit. A repeated evaluation of 100 workbench runs supports measurable delay, pacing, failure and restoration behavior. The timeout comparison improves observed completion from 0% to 100% by permitting longer waiting, while the high-rate pacing result exposes a concrete limitation. Packet analysis and reviewed routing observations provide complementary evidence. The system is useful for local development testing and networking education because configurations, measurements and explanations can be examined together.</w:t>
       </w:r>
     </w:p>
     <w:p>
       <w:pPr>
         <w:pStyle w:val="Heading1"/>
       </w:pPr>
-      <w:bookmarkStart w:id="22" w:name="_Toc244027359"/>
+      <w:bookmarkStart w:id="22" w:name="_Toc244031172"/>
       <w:r>
         <w:lastRenderedPageBreak/>
         <w:t>12. Limitations and Future Enhancement</w:t>
@@ -12864,7 +12813,7 @@
         <w:pStyle w:val="Heading1"/>
         <w:pageBreakBefore/>
       </w:pPr>
-      <w:bookmarkStart w:id="23" w:name="_Toc244027360"/>
+      <w:bookmarkStart w:id="23" w:name="_Toc244031173"/>
       <w:r>
         <w:lastRenderedPageBreak/>
         <w:t>References</w:t>
@@ -12876,113 +12825,190 @@
         <w:keepNext/>
       </w:pPr>
       <w:r>
-        <w:t>[1] IETF. HTTP Semantics. RFC 9110.</w:t>
+        <w:t>[1] A. Basiri, N. Behnam, R. de Rooij, L. Hochstein, L. Kosewski, J. Reynolds, and C. Rosenthal, “Chaos Engineering,” IEEE Software, vol. 33, no. 3, pp. 35–41, 2016.</w:t>
       </w:r>
     </w:p>
     <w:p>
+      <w:pPr>
+        <w:keepNext/>
+      </w:pPr>
+      <w:r>
+        <w:t xml:space="preserve">DOI: </w:t>
+      </w:r>
       <w:hyperlink r:id="rId21">
         <w:r>
-          <w:t>https://www.rfc-editor.org/rfc/rfc9110</w:t>
-        </w:r>
-      </w:hyperlink>
-    </w:p>
-    <w:p>
-      <w:pPr>
-        <w:keepNext/>
-      </w:pPr>
-      <w:r>
-        <w:t>[2] Node.js. Performance measurement APIs and HTTP documentation.</w:t>
-      </w:r>
-    </w:p>
-    <w:p>
-      <w:hyperlink r:id="rId22">
-        <w:r>
-          <w:t>https://nodejs.org/docs/latest-v22.x/api/perf_hooks.html</w:t>
-        </w:r>
-      </w:hyperlink>
-    </w:p>
-    <w:p>
-      <w:pPr>
-        <w:keepNext/>
-      </w:pPr>
-      <w:r>
-        <w:t>[3] Shopify. Toxiproxy official repository and documentation.</w:t>
-      </w:r>
-    </w:p>
-    <w:p>
-      <w:hyperlink r:id="rId23">
-        <w:r>
-          <w:t>https://github.com/Shopify/toxiproxy</w:t>
-        </w:r>
-      </w:hyperlink>
-    </w:p>
-    <w:p>
-      <w:pPr>
-        <w:keepNext/>
-      </w:pPr>
-      <w:r>
-        <w:t>[4] Wireshark. User Guide, Packet Reassembly and Follow Protocol Streams.</w:t>
-      </w:r>
-    </w:p>
-    <w:p>
-      <w:hyperlink r:id="rId24">
-        <w:r>
-          <w:t>https://www.wireshark.org/docs/wsug_html_chunked/ChAdvReassemblySection.html</w:t>
-        </w:r>
-      </w:hyperlink>
-    </w:p>
-    <w:p>
-      <w:pPr>
-        <w:keepNext/>
-      </w:pPr>
-      <w:r>
-        <w:t>[5] Malkin, G. RIP Version 2. RFC 2453.</w:t>
-      </w:r>
-    </w:p>
-    <w:p>
-      <w:hyperlink r:id="rId25">
-        <w:r>
-          <w:t>https://www.rfc-editor.org/rfc/rfc2453</w:t>
-        </w:r>
-      </w:hyperlink>
-    </w:p>
-    <w:p>
-      <w:pPr>
-        <w:keepNext/>
-      </w:pPr>
-      <w:r>
-        <w:t>[6] Moy, J. OSPF Version 2. RFC 2328.</w:t>
-      </w:r>
-    </w:p>
-    <w:p>
-      <w:hyperlink r:id="rId26">
-        <w:r>
-          <w:t>https://www.rfc-editor.org/rfc/rfc2328</w:t>
-        </w:r>
-      </w:hyperlink>
-    </w:p>
-    <w:p>
-      <w:pPr>
-        <w:keepNext/>
-      </w:pPr>
-      <w:r>
-        <w:t>[7] FaultNet. Source, implementation contracts and reproducible evaluation scripts.</w:t>
-      </w:r>
-    </w:p>
-    <w:p>
-      <w:hyperlink r:id="rId27">
-        <w:r>
-          <w:t>https://github.com/Pranav-Suresh1024/FaultNet</w:t>
+          <w:t>10.1109/MS.2016.60</w:t>
         </w:r>
       </w:hyperlink>
     </w:p>
     <w:p>
       <w:r>
-        <w:t>Repository evidence: scripts/evaluate-report.mjs, scripts/analyze-report.py, docs/reports/evidence/summary.json, scenario-comparison.csv and packet-summary.json. Routing observations are documented in docs/packet-tracer-review.md. Raw captures and generated experiment records remain local; the shared aggregates and procedures identify how the reported results were derived.</w:t>
+        <w:t xml:space="preserve">Free full text: </w:t>
+      </w:r>
+      <w:hyperlink r:id="rId22">
+        <w:r>
+          <w:t>Full author manuscript deposited on arXiv</w:t>
+        </w:r>
+      </w:hyperlink>
+    </w:p>
+    <w:p>
+      <w:pPr>
+        <w:keepNext/>
+      </w:pPr>
+      <w:r>
+        <w:t>[2] P. Alvaro, J. Rosen, and J. M. Hellerstein, “Lineage-driven Fault Injection,” Proceedings of the ACM SIGMOD International Conference on Management of Data, pp. 331–346, 2015.</w:t>
       </w:r>
     </w:p>
+    <w:p>
+      <w:pPr>
+        <w:keepNext/>
+      </w:pPr>
+      <w:r>
+        <w:t xml:space="preserve">DOI: </w:t>
+      </w:r>
+      <w:hyperlink r:id="rId23">
+        <w:r>
+          <w:t>10.1145/2723372.2723711</w:t>
+        </w:r>
+      </w:hyperlink>
+    </w:p>
+    <w:p>
+      <w:r>
+        <w:t xml:space="preserve">Free full text: </w:t>
+      </w:r>
+      <w:hyperlink r:id="rId24">
+        <w:r>
+          <w:t>Full paper hosted by the author at UC Santa Cruz</w:t>
+        </w:r>
+      </w:hyperlink>
+    </w:p>
+    <w:p>
+      <w:pPr>
+        <w:keepNext/>
+      </w:pPr>
+      <w:r>
+        <w:t>[3] M. Carbone and L. Rizzo, “Dummynet Revisited,” ACM SIGCOMM Computer Communication Review, vol. 40, no. 2, pp. 12–20, 2010.</w:t>
+      </w:r>
+    </w:p>
+    <w:p>
+      <w:pPr>
+        <w:keepNext/>
+      </w:pPr>
+      <w:r>
+        <w:t xml:space="preserve">DOI: </w:t>
+      </w:r>
+      <w:hyperlink r:id="rId25">
+        <w:r>
+          <w:t>10.1145/1764873.1764876</w:t>
+        </w:r>
+      </w:hyperlink>
+    </w:p>
+    <w:p>
+      <w:r>
+        <w:t xml:space="preserve">Free full text: </w:t>
+      </w:r>
+      <w:hyperlink r:id="rId26">
+        <w:r>
+          <w:t>Full author manuscript hosted at the University of Pisa</w:t>
+        </w:r>
+      </w:hyperlink>
+    </w:p>
+    <w:p>
+      <w:pPr>
+        <w:keepNext/>
+      </w:pPr>
+      <w:r>
+        <w:t>[4] V. Paxson, “End-to-End Internet Packet Dynamics,” Proceedings of ACM SIGCOMM, pp. 139–152, 1997.</w:t>
+      </w:r>
+    </w:p>
+    <w:p>
+      <w:pPr>
+        <w:keepNext/>
+      </w:pPr>
+      <w:r>
+        <w:t xml:space="preserve">DOI: </w:t>
+      </w:r>
+      <w:hyperlink r:id="rId27">
+        <w:r>
+          <w:t>10.1145/263105.263155</w:t>
+        </w:r>
+      </w:hyperlink>
+    </w:p>
+    <w:p>
+      <w:r>
+        <w:t xml:space="preserve">Free full text: </w:t>
+      </w:r>
+      <w:hyperlink r:id="rId28">
+        <w:r>
+          <w:t>Full conference paper hosted at UC San Diego</w:t>
+        </w:r>
+      </w:hyperlink>
+    </w:p>
+    <w:p>
+      <w:pPr>
+        <w:keepNext/>
+      </w:pPr>
+      <w:r>
+        <w:t>[5] B. Lantz, B. Heller, and N. McKeown, “A Network in a Laptop: Rapid Prototyping for Software-Defined Networks,” Proceedings of the 9th ACM SIGCOMM Workshop on Hot Topics in Networks, pp. 1–6, 2010.</w:t>
+      </w:r>
+    </w:p>
+    <w:p>
+      <w:pPr>
+        <w:keepNext/>
+      </w:pPr>
+      <w:r>
+        <w:t xml:space="preserve">DOI: </w:t>
+      </w:r>
+      <w:hyperlink r:id="rId29">
+        <w:r>
+          <w:t>10.1145/1868447.1868466</w:t>
+        </w:r>
+      </w:hyperlink>
+    </w:p>
+    <w:p>
+      <w:r>
+        <w:t xml:space="preserve">Free full text: </w:t>
+      </w:r>
+      <w:hyperlink r:id="rId30">
+        <w:r>
+          <w:t>Full workshop paper hosted by the author at Stanford University</w:t>
+        </w:r>
+      </w:hyperlink>
+    </w:p>
+    <w:p>
+      <w:pPr>
+        <w:keepNext/>
+      </w:pPr>
+      <w:r>
+        <w:t>[6] N. Handigol, B. Heller, V. Jeyakumar, B. Lantz, and N. McKeown, “Reproducible Network Experiments Using Container-Based Emulation,” Proceedings of the 8th International Conference on Emerging Networking Experiments and Technologies (CoNEXT), pp. 253–264, 2012.</w:t>
+      </w:r>
+    </w:p>
+    <w:p>
+      <w:pPr>
+        <w:keepNext/>
+      </w:pPr>
+      <w:r>
+        <w:t xml:space="preserve">DOI: </w:t>
+      </w:r>
+      <w:hyperlink r:id="rId31">
+        <w:r>
+          <w:t>10.1145/2413176.2413206</w:t>
+        </w:r>
+      </w:hyperlink>
+    </w:p>
+    <w:p>
+      <w:r>
+        <w:t xml:space="preserve">Free full text: </w:t>
+      </w:r>
+      <w:hyperlink r:id="rId32">
+        <w:r>
+          <w:t>Full published conference paper from the ACM SIGCOMM conference proceedings site</w:t>
+        </w:r>
+      </w:hyperlink>
+    </w:p>
+    <w:p/>
     <w:sectPr>
-      <w:footerReference w:type="default" r:id="rId28"/>
+      <w:footerReference w:type="default" r:id="rId33"/>
       <w:pgSz w:w="11909" w:h="16834"/>
       <w:pgMar w:top="1224" w:right="1368" w:bottom="1224" w:left="1368" w:header="720" w:footer="576" w:gutter="0"/>
       <w:cols w:space="720"/>

</xml_diff>